<commit_message>
Agregando carpeta de imagenes y enlazando fuentes y actualizando informes
</commit_message>
<xml_diff>
--- a/documentacion/DocumentacionDelProyecto.docx
+++ b/documentacion/DocumentacionDelProyecto.docx
@@ -314,7 +314,43 @@
           <w:sz w:val="32"/>
           <w:szCs w:val="32"/>
         </w:rPr>
-        <w:t xml:space="preserve"> en github y comenzamos a trabajar sobre el mismo. Creamos un boceto en papel y lápiz sobre como iba a ser la página web:</w:t>
+        <w:t xml:space="preserve"> en </w:t>
+      </w:r>
+      <w:proofErr w:type="spellStart"/>
+      <w:r>
+        <w:rPr>
+          <w:rFonts w:ascii="Bahnschrift SemiBold SemiConden" w:hAnsi="Bahnschrift SemiBold SemiConden"/>
+          <w:sz w:val="32"/>
+          <w:szCs w:val="32"/>
+        </w:rPr>
+        <w:t>github</w:t>
+      </w:r>
+      <w:proofErr w:type="spellEnd"/>
+      <w:r>
+        <w:rPr>
+          <w:rFonts w:ascii="Bahnschrift SemiBold SemiConden" w:hAnsi="Bahnschrift SemiBold SemiConden"/>
+          <w:sz w:val="32"/>
+          <w:szCs w:val="32"/>
+        </w:rPr>
+        <w:t xml:space="preserve"> y comenzamos a trabajar sobre el mismo. Creamos un boceto en papel y lápiz sobre </w:t>
+      </w:r>
+      <w:proofErr w:type="spellStart"/>
+      <w:r>
+        <w:rPr>
+          <w:rFonts w:ascii="Bahnschrift SemiBold SemiConden" w:hAnsi="Bahnschrift SemiBold SemiConden"/>
+          <w:sz w:val="32"/>
+          <w:szCs w:val="32"/>
+        </w:rPr>
+        <w:t>como</w:t>
+      </w:r>
+      <w:proofErr w:type="spellEnd"/>
+      <w:r>
+        <w:rPr>
+          <w:rFonts w:ascii="Bahnschrift SemiBold SemiConden" w:hAnsi="Bahnschrift SemiBold SemiConden"/>
+          <w:sz w:val="32"/>
+          <w:szCs w:val="32"/>
+        </w:rPr>
+        <w:t xml:space="preserve"> iba a ser la página web:</w:t>
       </w:r>
     </w:p>
     <w:p>
@@ -489,6 +525,7 @@
       <w:r>
         <w:rPr>
           <w:rFonts w:ascii="Bahnschrift SemiBold SemiConden" w:hAnsi="Bahnschrift SemiBold SemiConden"/>
+          <w:noProof/>
           <w:sz w:val="32"/>
           <w:szCs w:val="32"/>
         </w:rPr>
@@ -574,6 +611,7 @@
       <w:r>
         <w:rPr>
           <w:rFonts w:ascii="Bahnschrift SemiBold SemiConden" w:hAnsi="Bahnschrift SemiBold SemiConden"/>
+          <w:noProof/>
           <w:sz w:val="32"/>
           <w:szCs w:val="32"/>
         </w:rPr>
@@ -628,20 +666,39 @@
           <w:sz w:val="32"/>
           <w:szCs w:val="32"/>
         </w:rPr>
-        <w:t>Trabajamos un poco sobre el index, Estructurándola y agregando imágenes.</w:t>
-      </w:r>
-    </w:p>
-    <w:p>
-      <w:pPr>
-        <w:rPr>
-          <w:rFonts w:ascii="Bahnschrift SemiBold SemiConden" w:hAnsi="Bahnschrift SemiBold SemiConden"/>
-          <w:sz w:val="32"/>
-          <w:szCs w:val="32"/>
-        </w:rPr>
-      </w:pPr>
-      <w:r>
-        <w:rPr>
-          <w:rFonts w:ascii="Bahnschrift SemiBold SemiConden" w:hAnsi="Bahnschrift SemiBold SemiConden"/>
+        <w:t xml:space="preserve">Trabajamos un poco sobre el </w:t>
+      </w:r>
+      <w:proofErr w:type="spellStart"/>
+      <w:r>
+        <w:rPr>
+          <w:rFonts w:ascii="Bahnschrift SemiBold SemiConden" w:hAnsi="Bahnschrift SemiBold SemiConden"/>
+          <w:sz w:val="32"/>
+          <w:szCs w:val="32"/>
+        </w:rPr>
+        <w:t>index</w:t>
+      </w:r>
+      <w:proofErr w:type="spellEnd"/>
+      <w:r>
+        <w:rPr>
+          <w:rFonts w:ascii="Bahnschrift SemiBold SemiConden" w:hAnsi="Bahnschrift SemiBold SemiConden"/>
+          <w:sz w:val="32"/>
+          <w:szCs w:val="32"/>
+        </w:rPr>
+        <w:t>, Estructurándola y agregando imágenes.</w:t>
+      </w:r>
+    </w:p>
+    <w:p>
+      <w:pPr>
+        <w:rPr>
+          <w:rFonts w:ascii="Bahnschrift SemiBold SemiConden" w:hAnsi="Bahnschrift SemiBold SemiConden"/>
+          <w:sz w:val="32"/>
+          <w:szCs w:val="32"/>
+        </w:rPr>
+      </w:pPr>
+      <w:r>
+        <w:rPr>
+          <w:rFonts w:ascii="Bahnschrift SemiBold SemiConden" w:hAnsi="Bahnschrift SemiBold SemiConden"/>
+          <w:noProof/>
           <w:sz w:val="32"/>
           <w:szCs w:val="32"/>
         </w:rPr>
@@ -707,9 +764,424 @@
           <w:szCs w:val="32"/>
         </w:rPr>
       </w:pPr>
+      <w:r>
+        <w:rPr>
+          <w:rFonts w:ascii="Bahnschrift SemiBold SemiConden" w:hAnsi="Bahnschrift SemiBold SemiConden"/>
+          <w:sz w:val="32"/>
+          <w:szCs w:val="32"/>
+        </w:rPr>
+        <w:lastRenderedPageBreak/>
+        <w:drawing>
+          <wp:inline distT="0" distB="0" distL="0" distR="0" wp14:anchorId="55FE426A" wp14:editId="01BE870B">
+            <wp:extent cx="3965713" cy="2637571"/>
+            <wp:effectExtent l="0" t="0" r="0" b="0"/>
+            <wp:docPr id="318883285" name="Imagen 1"/>
+            <wp:cNvGraphicFramePr>
+              <a:graphicFrameLocks xmlns:a="http://schemas.openxmlformats.org/drawingml/2006/main" noChangeAspect="1"/>
+            </wp:cNvGraphicFramePr>
+            <a:graphic xmlns:a="http://schemas.openxmlformats.org/drawingml/2006/main">
+              <a:graphicData uri="http://schemas.openxmlformats.org/drawingml/2006/picture">
+                <pic:pic xmlns:pic="http://schemas.openxmlformats.org/drawingml/2006/picture">
+                  <pic:nvPicPr>
+                    <pic:cNvPr id="318883285" name=""/>
+                    <pic:cNvPicPr/>
+                  </pic:nvPicPr>
+                  <pic:blipFill>
+                    <a:blip r:embed="rId12"/>
+                    <a:stretch>
+                      <a:fillRect/>
+                    </a:stretch>
+                  </pic:blipFill>
+                  <pic:spPr>
+                    <a:xfrm>
+                      <a:off x="0" y="0"/>
+                      <a:ext cx="3968134" cy="2639181"/>
+                    </a:xfrm>
+                    <a:prstGeom prst="rect">
+                      <a:avLst/>
+                    </a:prstGeom>
+                  </pic:spPr>
+                </pic:pic>
+              </a:graphicData>
+            </a:graphic>
+          </wp:inline>
+        </w:drawing>
+      </w:r>
+    </w:p>
+    <w:p>
+      <w:pPr>
+        <w:rPr>
+          <w:rFonts w:ascii="Bahnschrift SemiBold SemiConden" w:hAnsi="Bahnschrift SemiBold SemiConden"/>
+          <w:sz w:val="32"/>
+          <w:szCs w:val="32"/>
+        </w:rPr>
+      </w:pPr>
+      <w:r>
+        <w:rPr>
+          <w:rFonts w:ascii="Bahnschrift SemiBold SemiConden" w:hAnsi="Bahnschrift SemiBold SemiConden"/>
+          <w:sz w:val="32"/>
+          <w:szCs w:val="32"/>
+        </w:rPr>
+        <w:t xml:space="preserve">Añadimos iconos </w:t>
+      </w:r>
+      <w:proofErr w:type="spellStart"/>
+      <w:r>
+        <w:rPr>
+          <w:rFonts w:ascii="Bahnschrift SemiBold SemiConden" w:hAnsi="Bahnschrift SemiBold SemiConden"/>
+          <w:sz w:val="32"/>
+          <w:szCs w:val="32"/>
+        </w:rPr>
+        <w:t>y</w:t>
+      </w:r>
+      <w:proofErr w:type="spellEnd"/>
+      <w:r>
+        <w:rPr>
+          <w:rFonts w:ascii="Bahnschrift SemiBold SemiConden" w:hAnsi="Bahnschrift SemiBold SemiConden"/>
+          <w:sz w:val="32"/>
+          <w:szCs w:val="32"/>
+        </w:rPr>
+        <w:t xml:space="preserve"> imágenes de productos.</w:t>
+      </w:r>
+    </w:p>
+    <w:p>
+      <w:pPr>
+        <w:rPr>
+          <w:rFonts w:ascii="Bahnschrift SemiBold SemiConden" w:hAnsi="Bahnschrift SemiBold SemiConden"/>
+          <w:sz w:val="32"/>
+          <w:szCs w:val="32"/>
+        </w:rPr>
+      </w:pPr>
+      <w:r>
+        <w:rPr>
+          <w:rFonts w:ascii="Bahnschrift SemiBold SemiConden" w:hAnsi="Bahnschrift SemiBold SemiConden"/>
+          <w:sz w:val="32"/>
+          <w:szCs w:val="32"/>
+        </w:rPr>
+        <w:drawing>
+          <wp:inline distT="0" distB="0" distL="0" distR="0" wp14:anchorId="503DF250" wp14:editId="76482AFB">
+            <wp:extent cx="5400040" cy="3421380"/>
+            <wp:effectExtent l="0" t="0" r="0" b="7620"/>
+            <wp:docPr id="1443048797" name="Imagen 1"/>
+            <wp:cNvGraphicFramePr>
+              <a:graphicFrameLocks xmlns:a="http://schemas.openxmlformats.org/drawingml/2006/main" noChangeAspect="1"/>
+            </wp:cNvGraphicFramePr>
+            <a:graphic xmlns:a="http://schemas.openxmlformats.org/drawingml/2006/main">
+              <a:graphicData uri="http://schemas.openxmlformats.org/drawingml/2006/picture">
+                <pic:pic xmlns:pic="http://schemas.openxmlformats.org/drawingml/2006/picture">
+                  <pic:nvPicPr>
+                    <pic:cNvPr id="1443048797" name=""/>
+                    <pic:cNvPicPr/>
+                  </pic:nvPicPr>
+                  <pic:blipFill>
+                    <a:blip r:embed="rId13"/>
+                    <a:stretch>
+                      <a:fillRect/>
+                    </a:stretch>
+                  </pic:blipFill>
+                  <pic:spPr>
+                    <a:xfrm>
+                      <a:off x="0" y="0"/>
+                      <a:ext cx="5400040" cy="3421380"/>
+                    </a:xfrm>
+                    <a:prstGeom prst="rect">
+                      <a:avLst/>
+                    </a:prstGeom>
+                  </pic:spPr>
+                </pic:pic>
+              </a:graphicData>
+            </a:graphic>
+          </wp:inline>
+        </w:drawing>
+      </w:r>
+      <w:r>
+        <w:rPr>
+          <w:rFonts w:ascii="Bahnschrift SemiBold SemiConden" w:hAnsi="Bahnschrift SemiBold SemiConden"/>
+          <w:sz w:val="32"/>
+          <w:szCs w:val="32"/>
+        </w:rPr>
+        <w:t xml:space="preserve">Modificamos el archivo index.html, agregando la estructura semántica que vamos a seguir en todas las </w:t>
+      </w:r>
+      <w:proofErr w:type="spellStart"/>
+      <w:r>
+        <w:rPr>
+          <w:rFonts w:ascii="Bahnschrift SemiBold SemiConden" w:hAnsi="Bahnschrift SemiBold SemiConden"/>
+          <w:sz w:val="32"/>
+          <w:szCs w:val="32"/>
+        </w:rPr>
+        <w:t>paginas</w:t>
+      </w:r>
+      <w:proofErr w:type="spellEnd"/>
+      <w:r>
+        <w:rPr>
+          <w:rFonts w:ascii="Bahnschrift SemiBold SemiConden" w:hAnsi="Bahnschrift SemiBold SemiConden"/>
+          <w:sz w:val="32"/>
+          <w:szCs w:val="32"/>
+        </w:rPr>
+        <w:t>.</w:t>
+      </w:r>
+    </w:p>
+    <w:p>
+      <w:pPr>
+        <w:rPr>
+          <w:rFonts w:ascii="Bahnschrift SemiBold SemiConden" w:hAnsi="Bahnschrift SemiBold SemiConden"/>
+          <w:sz w:val="32"/>
+          <w:szCs w:val="32"/>
+        </w:rPr>
+      </w:pPr>
+      <w:r>
+        <w:rPr>
+          <w:rFonts w:ascii="Bahnschrift SemiBold SemiConden" w:hAnsi="Bahnschrift SemiBold SemiConden"/>
+          <w:sz w:val="32"/>
+          <w:szCs w:val="32"/>
+        </w:rPr>
+        <w:lastRenderedPageBreak/>
+        <w:drawing>
+          <wp:inline distT="0" distB="0" distL="0" distR="0" wp14:anchorId="50A312EE" wp14:editId="2D17613D">
+            <wp:extent cx="5400040" cy="2973070"/>
+            <wp:effectExtent l="0" t="0" r="0" b="0"/>
+            <wp:docPr id="672684998" name="Imagen 1"/>
+            <wp:cNvGraphicFramePr>
+              <a:graphicFrameLocks xmlns:a="http://schemas.openxmlformats.org/drawingml/2006/main" noChangeAspect="1"/>
+            </wp:cNvGraphicFramePr>
+            <a:graphic xmlns:a="http://schemas.openxmlformats.org/drawingml/2006/main">
+              <a:graphicData uri="http://schemas.openxmlformats.org/drawingml/2006/picture">
+                <pic:pic xmlns:pic="http://schemas.openxmlformats.org/drawingml/2006/picture">
+                  <pic:nvPicPr>
+                    <pic:cNvPr id="672684998" name=""/>
+                    <pic:cNvPicPr/>
+                  </pic:nvPicPr>
+                  <pic:blipFill>
+                    <a:blip r:embed="rId14"/>
+                    <a:stretch>
+                      <a:fillRect/>
+                    </a:stretch>
+                  </pic:blipFill>
+                  <pic:spPr>
+                    <a:xfrm>
+                      <a:off x="0" y="0"/>
+                      <a:ext cx="5400040" cy="2973070"/>
+                    </a:xfrm>
+                    <a:prstGeom prst="rect">
+                      <a:avLst/>
+                    </a:prstGeom>
+                  </pic:spPr>
+                </pic:pic>
+              </a:graphicData>
+            </a:graphic>
+          </wp:inline>
+        </w:drawing>
+      </w:r>
+    </w:p>
+    <w:p>
+      <w:pPr>
+        <w:rPr>
+          <w:rFonts w:ascii="Bahnschrift SemiBold SemiConden" w:hAnsi="Bahnschrift SemiBold SemiConden"/>
+          <w:sz w:val="32"/>
+          <w:szCs w:val="32"/>
+        </w:rPr>
+      </w:pPr>
+      <w:r>
+        <w:rPr>
+          <w:rFonts w:ascii="Bahnschrift SemiBold SemiConden" w:hAnsi="Bahnschrift SemiBold SemiConden"/>
+          <w:sz w:val="32"/>
+          <w:szCs w:val="32"/>
+        </w:rPr>
+        <w:t xml:space="preserve">Agregando al </w:t>
+      </w:r>
+      <w:proofErr w:type="spellStart"/>
+      <w:r>
+        <w:rPr>
+          <w:rFonts w:ascii="Bahnschrift SemiBold SemiConden" w:hAnsi="Bahnschrift SemiBold SemiConden"/>
+          <w:sz w:val="32"/>
+          <w:szCs w:val="32"/>
+        </w:rPr>
+        <w:t>css</w:t>
+      </w:r>
+      <w:proofErr w:type="spellEnd"/>
+      <w:r>
+        <w:rPr>
+          <w:rFonts w:ascii="Bahnschrift SemiBold SemiConden" w:hAnsi="Bahnschrift SemiBold SemiConden"/>
+          <w:sz w:val="32"/>
+          <w:szCs w:val="32"/>
+        </w:rPr>
+        <w:t xml:space="preserve"> las fuentes.</w:t>
+      </w:r>
+    </w:p>
+    <w:p>
+      <w:pPr>
+        <w:rPr>
+          <w:rFonts w:ascii="Bahnschrift SemiBold SemiConden" w:hAnsi="Bahnschrift SemiBold SemiConden"/>
+          <w:sz w:val="32"/>
+          <w:szCs w:val="32"/>
+        </w:rPr>
+      </w:pPr>
+      <w:r>
+        <w:rPr>
+          <w:rFonts w:ascii="Bahnschrift SemiBold SemiConden" w:hAnsi="Bahnschrift SemiBold SemiConden"/>
+          <w:sz w:val="32"/>
+          <w:szCs w:val="32"/>
+        </w:rPr>
+        <w:drawing>
+          <wp:inline distT="0" distB="0" distL="0" distR="0" wp14:anchorId="0FF195F4" wp14:editId="357C353D">
+            <wp:extent cx="4114800" cy="3388033"/>
+            <wp:effectExtent l="0" t="0" r="0" b="3175"/>
+            <wp:docPr id="1789487105" name="Imagen 1"/>
+            <wp:cNvGraphicFramePr>
+              <a:graphicFrameLocks xmlns:a="http://schemas.openxmlformats.org/drawingml/2006/main" noChangeAspect="1"/>
+            </wp:cNvGraphicFramePr>
+            <a:graphic xmlns:a="http://schemas.openxmlformats.org/drawingml/2006/main">
+              <a:graphicData uri="http://schemas.openxmlformats.org/drawingml/2006/picture">
+                <pic:pic xmlns:pic="http://schemas.openxmlformats.org/drawingml/2006/picture">
+                  <pic:nvPicPr>
+                    <pic:cNvPr id="1789487105" name=""/>
+                    <pic:cNvPicPr/>
+                  </pic:nvPicPr>
+                  <pic:blipFill>
+                    <a:blip r:embed="rId15"/>
+                    <a:stretch>
+                      <a:fillRect/>
+                    </a:stretch>
+                  </pic:blipFill>
+                  <pic:spPr>
+                    <a:xfrm>
+                      <a:off x="0" y="0"/>
+                      <a:ext cx="4119221" cy="3391673"/>
+                    </a:xfrm>
+                    <a:prstGeom prst="rect">
+                      <a:avLst/>
+                    </a:prstGeom>
+                  </pic:spPr>
+                </pic:pic>
+              </a:graphicData>
+            </a:graphic>
+          </wp:inline>
+        </w:drawing>
+      </w:r>
+    </w:p>
+    <w:p>
+      <w:pPr>
+        <w:rPr>
+          <w:rFonts w:ascii="Bahnschrift SemiBold SemiConden" w:hAnsi="Bahnschrift SemiBold SemiConden"/>
+          <w:sz w:val="32"/>
+          <w:szCs w:val="32"/>
+        </w:rPr>
+      </w:pPr>
+      <w:r>
+        <w:rPr>
+          <w:rFonts w:ascii="Bahnschrift SemiBold SemiConden" w:hAnsi="Bahnschrift SemiBold SemiConden"/>
+          <w:sz w:val="32"/>
+          <w:szCs w:val="32"/>
+        </w:rPr>
+        <w:t>También estuvimos trabajando sobre el diseño.</w:t>
+      </w:r>
+    </w:p>
+    <w:p>
+      <w:pPr>
+        <w:rPr>
+          <w:rFonts w:ascii="Bahnschrift SemiBold SemiConden" w:hAnsi="Bahnschrift SemiBold SemiConden"/>
+          <w:sz w:val="32"/>
+          <w:szCs w:val="32"/>
+        </w:rPr>
+      </w:pPr>
+    </w:p>
+    <w:p>
+      <w:pPr>
+        <w:rPr>
+          <w:rFonts w:ascii="Bahnschrift SemiBold SemiConden" w:hAnsi="Bahnschrift SemiBold SemiConden"/>
+          <w:sz w:val="32"/>
+          <w:szCs w:val="32"/>
+        </w:rPr>
+      </w:pPr>
+      <w:r>
+        <w:rPr>
+          <w:rFonts w:ascii="Bahnschrift SemiBold SemiConden" w:hAnsi="Bahnschrift SemiBold SemiConden"/>
+          <w:sz w:val="32"/>
+          <w:szCs w:val="32"/>
+        </w:rPr>
+        <w:lastRenderedPageBreak/>
+        <w:drawing>
+          <wp:inline distT="0" distB="0" distL="0" distR="0" wp14:anchorId="38FF2283" wp14:editId="34E1184B">
+            <wp:extent cx="5400040" cy="1161415"/>
+            <wp:effectExtent l="0" t="0" r="0" b="635"/>
+            <wp:docPr id="1595599040" name="Imagen 1"/>
+            <wp:cNvGraphicFramePr>
+              <a:graphicFrameLocks xmlns:a="http://schemas.openxmlformats.org/drawingml/2006/main" noChangeAspect="1"/>
+            </wp:cNvGraphicFramePr>
+            <a:graphic xmlns:a="http://schemas.openxmlformats.org/drawingml/2006/main">
+              <a:graphicData uri="http://schemas.openxmlformats.org/drawingml/2006/picture">
+                <pic:pic xmlns:pic="http://schemas.openxmlformats.org/drawingml/2006/picture">
+                  <pic:nvPicPr>
+                    <pic:cNvPr id="1595599040" name=""/>
+                    <pic:cNvPicPr/>
+                  </pic:nvPicPr>
+                  <pic:blipFill>
+                    <a:blip r:embed="rId16"/>
+                    <a:stretch>
+                      <a:fillRect/>
+                    </a:stretch>
+                  </pic:blipFill>
+                  <pic:spPr>
+                    <a:xfrm>
+                      <a:off x="0" y="0"/>
+                      <a:ext cx="5400040" cy="1161415"/>
+                    </a:xfrm>
+                    <a:prstGeom prst="rect">
+                      <a:avLst/>
+                    </a:prstGeom>
+                  </pic:spPr>
+                </pic:pic>
+              </a:graphicData>
+            </a:graphic>
+          </wp:inline>
+        </w:drawing>
+      </w:r>
+    </w:p>
+    <w:p>
+      <w:pPr>
+        <w:rPr>
+          <w:rFonts w:ascii="Bahnschrift SemiBold SemiConden" w:hAnsi="Bahnschrift SemiBold SemiConden"/>
+          <w:sz w:val="32"/>
+          <w:szCs w:val="32"/>
+        </w:rPr>
+      </w:pPr>
+      <w:r>
+        <w:rPr>
+          <w:rFonts w:ascii="Bahnschrift SemiBold SemiConden" w:hAnsi="Bahnschrift SemiBold SemiConden"/>
+          <w:sz w:val="32"/>
+          <w:szCs w:val="32"/>
+        </w:rPr>
+        <w:t>Progreso de la página.</w:t>
+      </w:r>
+    </w:p>
+    <w:p>
+      <w:pPr>
+        <w:rPr>
+          <w:rFonts w:ascii="Bahnschrift SemiBold SemiConden" w:hAnsi="Bahnschrift SemiBold SemiConden"/>
+          <w:sz w:val="32"/>
+          <w:szCs w:val="32"/>
+        </w:rPr>
+      </w:pPr>
+    </w:p>
+    <w:p>
+      <w:pPr>
+        <w:rPr>
+          <w:rFonts w:ascii="Bahnschrift SemiBold SemiConden" w:hAnsi="Bahnschrift SemiBold SemiConden"/>
+          <w:sz w:val="32"/>
+          <w:szCs w:val="32"/>
+        </w:rPr>
+      </w:pPr>
+    </w:p>
+    <w:p>
+      <w:pPr>
+        <w:rPr>
+          <w:rFonts w:ascii="Bahnschrift SemiBold SemiConden" w:hAnsi="Bahnschrift SemiBold SemiConden"/>
+          <w:sz w:val="32"/>
+          <w:szCs w:val="32"/>
+        </w:rPr>
+      </w:pPr>
     </w:p>
     <w:sectPr>
-      <w:footerReference w:type="default" r:id="rId12"/>
+      <w:footerReference w:type="default" r:id="rId17"/>
       <w:pgSz w:w="11906" w:h="16838"/>
       <w:pgMar w:top="1417" w:right="1701" w:bottom="1417" w:left="1701" w:header="708" w:footer="708" w:gutter="0"/>
       <w:cols w:space="708"/>

</xml_diff>

<commit_message>
Agregando paleta de colores
</commit_message>
<xml_diff>
--- a/documentacion/DocumentacionDelProyecto.docx
+++ b/documentacion/DocumentacionDelProyecto.docx
@@ -314,43 +314,7 @@
           <w:sz w:val="32"/>
           <w:szCs w:val="32"/>
         </w:rPr>
-        <w:t xml:space="preserve"> en </w:t>
-      </w:r>
-      <w:proofErr w:type="spellStart"/>
-      <w:r>
-        <w:rPr>
-          <w:rFonts w:ascii="Bahnschrift SemiBold SemiConden" w:hAnsi="Bahnschrift SemiBold SemiConden"/>
-          <w:sz w:val="32"/>
-          <w:szCs w:val="32"/>
-        </w:rPr>
-        <w:t>github</w:t>
-      </w:r>
-      <w:proofErr w:type="spellEnd"/>
-      <w:r>
-        <w:rPr>
-          <w:rFonts w:ascii="Bahnschrift SemiBold SemiConden" w:hAnsi="Bahnschrift SemiBold SemiConden"/>
-          <w:sz w:val="32"/>
-          <w:szCs w:val="32"/>
-        </w:rPr>
-        <w:t xml:space="preserve"> y comenzamos a trabajar sobre el mismo. Creamos un boceto en papel y lápiz sobre </w:t>
-      </w:r>
-      <w:proofErr w:type="spellStart"/>
-      <w:r>
-        <w:rPr>
-          <w:rFonts w:ascii="Bahnschrift SemiBold SemiConden" w:hAnsi="Bahnschrift SemiBold SemiConden"/>
-          <w:sz w:val="32"/>
-          <w:szCs w:val="32"/>
-        </w:rPr>
-        <w:t>como</w:t>
-      </w:r>
-      <w:proofErr w:type="spellEnd"/>
-      <w:r>
-        <w:rPr>
-          <w:rFonts w:ascii="Bahnschrift SemiBold SemiConden" w:hAnsi="Bahnschrift SemiBold SemiConden"/>
-          <w:sz w:val="32"/>
-          <w:szCs w:val="32"/>
-        </w:rPr>
-        <w:t xml:space="preserve"> iba a ser la página web:</w:t>
+        <w:t xml:space="preserve"> en github y comenzamos a trabajar sobre el mismo. Creamos un boceto en papel y lápiz sobre como iba a ser la página web:</w:t>
       </w:r>
     </w:p>
     <w:p>
@@ -666,25 +630,7 @@
           <w:sz w:val="32"/>
           <w:szCs w:val="32"/>
         </w:rPr>
-        <w:t xml:space="preserve">Trabajamos un poco sobre el </w:t>
-      </w:r>
-      <w:proofErr w:type="spellStart"/>
-      <w:r>
-        <w:rPr>
-          <w:rFonts w:ascii="Bahnschrift SemiBold SemiConden" w:hAnsi="Bahnschrift SemiBold SemiConden"/>
-          <w:sz w:val="32"/>
-          <w:szCs w:val="32"/>
-        </w:rPr>
-        <w:t>index</w:t>
-      </w:r>
-      <w:proofErr w:type="spellEnd"/>
-      <w:r>
-        <w:rPr>
-          <w:rFonts w:ascii="Bahnschrift SemiBold SemiConden" w:hAnsi="Bahnschrift SemiBold SemiConden"/>
-          <w:sz w:val="32"/>
-          <w:szCs w:val="32"/>
-        </w:rPr>
-        <w:t>, Estructurándola y agregando imágenes.</w:t>
+        <w:t>Trabajamos un poco sobre el index, Estructurándola y agregando imágenes.</w:t>
       </w:r>
     </w:p>
     <w:p>
@@ -767,6 +713,7 @@
       <w:r>
         <w:rPr>
           <w:rFonts w:ascii="Bahnschrift SemiBold SemiConden" w:hAnsi="Bahnschrift SemiBold SemiConden"/>
+          <w:noProof/>
           <w:sz w:val="32"/>
           <w:szCs w:val="32"/>
         </w:rPr>
@@ -822,38 +769,21 @@
           <w:sz w:val="32"/>
           <w:szCs w:val="32"/>
         </w:rPr>
-        <w:t xml:space="preserve">Añadimos iconos </w:t>
-      </w:r>
-      <w:proofErr w:type="spellStart"/>
-      <w:r>
-        <w:rPr>
-          <w:rFonts w:ascii="Bahnschrift SemiBold SemiConden" w:hAnsi="Bahnschrift SemiBold SemiConden"/>
-          <w:sz w:val="32"/>
-          <w:szCs w:val="32"/>
-        </w:rPr>
-        <w:t>y</w:t>
-      </w:r>
-      <w:proofErr w:type="spellEnd"/>
-      <w:r>
-        <w:rPr>
-          <w:rFonts w:ascii="Bahnschrift SemiBold SemiConden" w:hAnsi="Bahnschrift SemiBold SemiConden"/>
-          <w:sz w:val="32"/>
-          <w:szCs w:val="32"/>
-        </w:rPr>
-        <w:t xml:space="preserve"> imágenes de productos.</w:t>
-      </w:r>
-    </w:p>
-    <w:p>
-      <w:pPr>
-        <w:rPr>
-          <w:rFonts w:ascii="Bahnschrift SemiBold SemiConden" w:hAnsi="Bahnschrift SemiBold SemiConden"/>
-          <w:sz w:val="32"/>
-          <w:szCs w:val="32"/>
-        </w:rPr>
-      </w:pPr>
-      <w:r>
-        <w:rPr>
-          <w:rFonts w:ascii="Bahnschrift SemiBold SemiConden" w:hAnsi="Bahnschrift SemiBold SemiConden"/>
+        <w:t>Añadimos iconos y imágenes de productos.</w:t>
+      </w:r>
+    </w:p>
+    <w:p>
+      <w:pPr>
+        <w:rPr>
+          <w:rFonts w:ascii="Bahnschrift SemiBold SemiConden" w:hAnsi="Bahnschrift SemiBold SemiConden"/>
+          <w:sz w:val="32"/>
+          <w:szCs w:val="32"/>
+        </w:rPr>
+      </w:pPr>
+      <w:r>
+        <w:rPr>
+          <w:rFonts w:ascii="Bahnschrift SemiBold SemiConden" w:hAnsi="Bahnschrift SemiBold SemiConden"/>
+          <w:noProof/>
           <w:sz w:val="32"/>
           <w:szCs w:val="32"/>
         </w:rPr>
@@ -899,38 +829,21 @@
           <w:sz w:val="32"/>
           <w:szCs w:val="32"/>
         </w:rPr>
-        <w:t xml:space="preserve">Modificamos el archivo index.html, agregando la estructura semántica que vamos a seguir en todas las </w:t>
-      </w:r>
-      <w:proofErr w:type="spellStart"/>
-      <w:r>
-        <w:rPr>
-          <w:rFonts w:ascii="Bahnschrift SemiBold SemiConden" w:hAnsi="Bahnschrift SemiBold SemiConden"/>
-          <w:sz w:val="32"/>
-          <w:szCs w:val="32"/>
-        </w:rPr>
-        <w:t>paginas</w:t>
-      </w:r>
-      <w:proofErr w:type="spellEnd"/>
-      <w:r>
-        <w:rPr>
-          <w:rFonts w:ascii="Bahnschrift SemiBold SemiConden" w:hAnsi="Bahnschrift SemiBold SemiConden"/>
-          <w:sz w:val="32"/>
-          <w:szCs w:val="32"/>
-        </w:rPr>
-        <w:t>.</w:t>
-      </w:r>
-    </w:p>
-    <w:p>
-      <w:pPr>
-        <w:rPr>
-          <w:rFonts w:ascii="Bahnschrift SemiBold SemiConden" w:hAnsi="Bahnschrift SemiBold SemiConden"/>
-          <w:sz w:val="32"/>
-          <w:szCs w:val="32"/>
-        </w:rPr>
-      </w:pPr>
-      <w:r>
-        <w:rPr>
-          <w:rFonts w:ascii="Bahnschrift SemiBold SemiConden" w:hAnsi="Bahnschrift SemiBold SemiConden"/>
+        <w:t>Modificamos el archivo index.html, agregando la estructura semántica que vamos a seguir en todas las paginas.</w:t>
+      </w:r>
+    </w:p>
+    <w:p>
+      <w:pPr>
+        <w:rPr>
+          <w:rFonts w:ascii="Bahnschrift SemiBold SemiConden" w:hAnsi="Bahnschrift SemiBold SemiConden"/>
+          <w:sz w:val="32"/>
+          <w:szCs w:val="32"/>
+        </w:rPr>
+      </w:pPr>
+      <w:r>
+        <w:rPr>
+          <w:rFonts w:ascii="Bahnschrift SemiBold SemiConden" w:hAnsi="Bahnschrift SemiBold SemiConden"/>
+          <w:noProof/>
           <w:sz w:val="32"/>
           <w:szCs w:val="32"/>
         </w:rPr>
@@ -986,38 +899,21 @@
           <w:sz w:val="32"/>
           <w:szCs w:val="32"/>
         </w:rPr>
-        <w:t xml:space="preserve">Agregando al </w:t>
-      </w:r>
-      <w:proofErr w:type="spellStart"/>
-      <w:r>
-        <w:rPr>
-          <w:rFonts w:ascii="Bahnschrift SemiBold SemiConden" w:hAnsi="Bahnschrift SemiBold SemiConden"/>
-          <w:sz w:val="32"/>
-          <w:szCs w:val="32"/>
-        </w:rPr>
-        <w:t>css</w:t>
-      </w:r>
-      <w:proofErr w:type="spellEnd"/>
-      <w:r>
-        <w:rPr>
-          <w:rFonts w:ascii="Bahnschrift SemiBold SemiConden" w:hAnsi="Bahnschrift SemiBold SemiConden"/>
-          <w:sz w:val="32"/>
-          <w:szCs w:val="32"/>
-        </w:rPr>
-        <w:t xml:space="preserve"> las fuentes.</w:t>
-      </w:r>
-    </w:p>
-    <w:p>
-      <w:pPr>
-        <w:rPr>
-          <w:rFonts w:ascii="Bahnschrift SemiBold SemiConden" w:hAnsi="Bahnschrift SemiBold SemiConden"/>
-          <w:sz w:val="32"/>
-          <w:szCs w:val="32"/>
-        </w:rPr>
-      </w:pPr>
-      <w:r>
-        <w:rPr>
-          <w:rFonts w:ascii="Bahnschrift SemiBold SemiConden" w:hAnsi="Bahnschrift SemiBold SemiConden"/>
+        <w:t>Agregando al css las fuentes.</w:t>
+      </w:r>
+    </w:p>
+    <w:p>
+      <w:pPr>
+        <w:rPr>
+          <w:rFonts w:ascii="Bahnschrift SemiBold SemiConden" w:hAnsi="Bahnschrift SemiBold SemiConden"/>
+          <w:sz w:val="32"/>
+          <w:szCs w:val="32"/>
+        </w:rPr>
+      </w:pPr>
+      <w:r>
+        <w:rPr>
+          <w:rFonts w:ascii="Bahnschrift SemiBold SemiConden" w:hAnsi="Bahnschrift SemiBold SemiConden"/>
+          <w:noProof/>
           <w:sz w:val="32"/>
           <w:szCs w:val="32"/>
         </w:rPr>
@@ -1095,6 +991,7 @@
       <w:r>
         <w:rPr>
           <w:rFonts w:ascii="Bahnschrift SemiBold SemiConden" w:hAnsi="Bahnschrift SemiBold SemiConden"/>
+          <w:noProof/>
           <w:sz w:val="32"/>
           <w:szCs w:val="32"/>
         </w:rPr>
@@ -1170,6 +1067,65 @@
           <w:szCs w:val="32"/>
         </w:rPr>
       </w:pPr>
+      <w:r>
+        <w:rPr>
+          <w:rFonts w:ascii="Bahnschrift SemiBold SemiConden" w:hAnsi="Bahnschrift SemiBold SemiConden"/>
+          <w:sz w:val="32"/>
+          <w:szCs w:val="32"/>
+        </w:rPr>
+        <w:drawing>
+          <wp:inline distT="0" distB="0" distL="0" distR="0" wp14:anchorId="2CF97D54" wp14:editId="028D680B">
+            <wp:extent cx="4094922" cy="2894555"/>
+            <wp:effectExtent l="0" t="0" r="1270" b="1270"/>
+            <wp:docPr id="1740197532" name="Imagen 1"/>
+            <wp:cNvGraphicFramePr>
+              <a:graphicFrameLocks xmlns:a="http://schemas.openxmlformats.org/drawingml/2006/main" noChangeAspect="1"/>
+            </wp:cNvGraphicFramePr>
+            <a:graphic xmlns:a="http://schemas.openxmlformats.org/drawingml/2006/main">
+              <a:graphicData uri="http://schemas.openxmlformats.org/drawingml/2006/picture">
+                <pic:pic xmlns:pic="http://schemas.openxmlformats.org/drawingml/2006/picture">
+                  <pic:nvPicPr>
+                    <pic:cNvPr id="1740197532" name=""/>
+                    <pic:cNvPicPr/>
+                  </pic:nvPicPr>
+                  <pic:blipFill>
+                    <a:blip r:embed="rId17"/>
+                    <a:stretch>
+                      <a:fillRect/>
+                    </a:stretch>
+                  </pic:blipFill>
+                  <pic:spPr>
+                    <a:xfrm>
+                      <a:off x="0" y="0"/>
+                      <a:ext cx="4097007" cy="2896029"/>
+                    </a:xfrm>
+                    <a:prstGeom prst="rect">
+                      <a:avLst/>
+                    </a:prstGeom>
+                  </pic:spPr>
+                </pic:pic>
+              </a:graphicData>
+            </a:graphic>
+          </wp:inline>
+        </w:drawing>
+      </w:r>
+    </w:p>
+    <w:p>
+      <w:pPr>
+        <w:rPr>
+          <w:rFonts w:ascii="Bahnschrift SemiBold SemiConden" w:hAnsi="Bahnschrift SemiBold SemiConden"/>
+          <w:sz w:val="32"/>
+          <w:szCs w:val="32"/>
+        </w:rPr>
+      </w:pPr>
+      <w:r>
+        <w:rPr>
+          <w:rFonts w:ascii="Bahnschrift SemiBold SemiConden" w:hAnsi="Bahnschrift SemiBold SemiConden"/>
+          <w:sz w:val="32"/>
+          <w:szCs w:val="32"/>
+        </w:rPr>
+        <w:t>Añadiendo paleta de colores en variables.</w:t>
+      </w:r>
     </w:p>
     <w:p>
       <w:pPr>
@@ -1181,7 +1137,7 @@
       </w:pPr>
     </w:p>
     <w:sectPr>
-      <w:footerReference w:type="default" r:id="rId17"/>
+      <w:footerReference w:type="default" r:id="rId18"/>
       <w:pgSz w:w="11906" w:h="16838"/>
       <w:pgMar w:top="1417" w:right="1701" w:bottom="1417" w:left="1701" w:header="708" w:footer="708" w:gutter="0"/>
       <w:cols w:space="708"/>

</xml_diff>

<commit_message>
Actualizando documentacion del proyecto
</commit_message>
<xml_diff>
--- a/documentacion/DocumentacionDelProyecto.docx
+++ b/documentacion/DocumentacionDelProyecto.docx
@@ -278,34 +278,17 @@
       <w:pPr>
         <w:rPr>
           <w:rFonts w:ascii="Bahnschrift SemiBold SemiConden" w:hAnsi="Bahnschrift SemiBold SemiConden"/>
-          <w:sz w:val="44"/>
-          <w:szCs w:val="44"/>
-        </w:rPr>
-      </w:pPr>
-      <w:r>
-        <w:rPr>
-          <w:rFonts w:ascii="Bahnschrift SemiBold SemiConden" w:hAnsi="Bahnschrift SemiBold SemiConden"/>
-          <w:sz w:val="44"/>
-          <w:szCs w:val="44"/>
+          <w:sz w:val="32"/>
+          <w:szCs w:val="32"/>
+        </w:rPr>
+      </w:pPr>
+      <w:r>
+        <w:rPr>
+          <w:rFonts w:ascii="Bahnschrift SemiBold SemiConden" w:hAnsi="Bahnschrift SemiBold SemiConden"/>
+          <w:sz w:val="32"/>
+          <w:szCs w:val="32"/>
         </w:rPr>
         <w:lastRenderedPageBreak/>
-        <w:t>Fecha:19/05/2026</w:t>
-      </w:r>
-    </w:p>
-    <w:p>
-      <w:pPr>
-        <w:rPr>
-          <w:rFonts w:ascii="Bahnschrift SemiBold SemiConden" w:hAnsi="Bahnschrift SemiBold SemiConden"/>
-          <w:sz w:val="32"/>
-          <w:szCs w:val="32"/>
-        </w:rPr>
-      </w:pPr>
-      <w:r>
-        <w:rPr>
-          <w:rFonts w:ascii="Bahnschrift SemiBold SemiConden" w:hAnsi="Bahnschrift SemiBold SemiConden"/>
-          <w:sz w:val="32"/>
-          <w:szCs w:val="32"/>
-        </w:rPr>
         <w:t>En el día hoy creamos el repositorio</w:t>
       </w:r>
       <w:r>
@@ -314,7 +297,43 @@
           <w:sz w:val="32"/>
           <w:szCs w:val="32"/>
         </w:rPr>
-        <w:t xml:space="preserve"> en github y comenzamos a trabajar sobre el mismo. Creamos un boceto en papel y lápiz sobre como iba a ser la página web:</w:t>
+        <w:t xml:space="preserve"> en </w:t>
+      </w:r>
+      <w:proofErr w:type="spellStart"/>
+      <w:r>
+        <w:rPr>
+          <w:rFonts w:ascii="Bahnschrift SemiBold SemiConden" w:hAnsi="Bahnschrift SemiBold SemiConden"/>
+          <w:sz w:val="32"/>
+          <w:szCs w:val="32"/>
+        </w:rPr>
+        <w:t>github</w:t>
+      </w:r>
+      <w:proofErr w:type="spellEnd"/>
+      <w:r>
+        <w:rPr>
+          <w:rFonts w:ascii="Bahnschrift SemiBold SemiConden" w:hAnsi="Bahnschrift SemiBold SemiConden"/>
+          <w:sz w:val="32"/>
+          <w:szCs w:val="32"/>
+        </w:rPr>
+        <w:t xml:space="preserve"> y comenzamos a trabajar sobre el mismo. Creamos un boceto en papel y lápiz sobre </w:t>
+      </w:r>
+      <w:proofErr w:type="spellStart"/>
+      <w:r>
+        <w:rPr>
+          <w:rFonts w:ascii="Bahnschrift SemiBold SemiConden" w:hAnsi="Bahnschrift SemiBold SemiConden"/>
+          <w:sz w:val="32"/>
+          <w:szCs w:val="32"/>
+        </w:rPr>
+        <w:t>como</w:t>
+      </w:r>
+      <w:proofErr w:type="spellEnd"/>
+      <w:r>
+        <w:rPr>
+          <w:rFonts w:ascii="Bahnschrift SemiBold SemiConden" w:hAnsi="Bahnschrift SemiBold SemiConden"/>
+          <w:sz w:val="32"/>
+          <w:szCs w:val="32"/>
+        </w:rPr>
+        <w:t xml:space="preserve"> iba a ser la página web:</w:t>
       </w:r>
     </w:p>
     <w:p>
@@ -544,41 +563,41 @@
           <w:sz w:val="32"/>
           <w:szCs w:val="32"/>
         </w:rPr>
+        <w:t>Luego creamos carpetas y los diferentes archivos</w:t>
+      </w:r>
+      <w:r>
+        <w:rPr>
+          <w:rFonts w:ascii="Bahnschrift SemiBold SemiConden" w:hAnsi="Bahnschrift SemiBold SemiConden"/>
+          <w:sz w:val="32"/>
+          <w:szCs w:val="32"/>
+        </w:rPr>
+        <w:t xml:space="preserve"> de la página web</w:t>
+      </w:r>
+      <w:r>
+        <w:rPr>
+          <w:rFonts w:ascii="Bahnschrift SemiBold SemiConden" w:hAnsi="Bahnschrift SemiBold SemiConden"/>
+          <w:sz w:val="32"/>
+          <w:szCs w:val="32"/>
+        </w:rPr>
+        <w:t>:</w:t>
+      </w:r>
+    </w:p>
+    <w:p>
+      <w:pPr>
+        <w:rPr>
+          <w:rFonts w:ascii="Bahnschrift SemiBold SemiConden" w:hAnsi="Bahnschrift SemiBold SemiConden"/>
+          <w:sz w:val="32"/>
+          <w:szCs w:val="32"/>
+        </w:rPr>
+      </w:pPr>
+      <w:r>
+        <w:rPr>
+          <w:rFonts w:ascii="Bahnschrift SemiBold SemiConden" w:hAnsi="Bahnschrift SemiBold SemiConden"/>
+          <w:noProof/>
+          <w:sz w:val="32"/>
+          <w:szCs w:val="32"/>
+        </w:rPr>
         <w:lastRenderedPageBreak/>
-        <w:t>Luego creamos carpetas y los diferentes archivos</w:t>
-      </w:r>
-      <w:r>
-        <w:rPr>
-          <w:rFonts w:ascii="Bahnschrift SemiBold SemiConden" w:hAnsi="Bahnschrift SemiBold SemiConden"/>
-          <w:sz w:val="32"/>
-          <w:szCs w:val="32"/>
-        </w:rPr>
-        <w:t xml:space="preserve"> de la página web</w:t>
-      </w:r>
-      <w:r>
-        <w:rPr>
-          <w:rFonts w:ascii="Bahnschrift SemiBold SemiConden" w:hAnsi="Bahnschrift SemiBold SemiConden"/>
-          <w:sz w:val="32"/>
-          <w:szCs w:val="32"/>
-        </w:rPr>
-        <w:t>:</w:t>
-      </w:r>
-    </w:p>
-    <w:p>
-      <w:pPr>
-        <w:rPr>
-          <w:rFonts w:ascii="Bahnschrift SemiBold SemiConden" w:hAnsi="Bahnschrift SemiBold SemiConden"/>
-          <w:sz w:val="32"/>
-          <w:szCs w:val="32"/>
-        </w:rPr>
-      </w:pPr>
-      <w:r>
-        <w:rPr>
-          <w:rFonts w:ascii="Bahnschrift SemiBold SemiConden" w:hAnsi="Bahnschrift SemiBold SemiConden"/>
-          <w:noProof/>
-          <w:sz w:val="32"/>
-          <w:szCs w:val="32"/>
-        </w:rPr>
         <w:drawing>
           <wp:inline distT="0" distB="0" distL="0" distR="0" wp14:anchorId="59FD313D" wp14:editId="6156C6A7">
             <wp:extent cx="5115639" cy="2781688"/>
@@ -630,7 +649,25 @@
           <w:sz w:val="32"/>
           <w:szCs w:val="32"/>
         </w:rPr>
-        <w:t>Trabajamos un poco sobre el index, Estructurándola y agregando imágenes.</w:t>
+        <w:t xml:space="preserve">Trabajamos un poco sobre el </w:t>
+      </w:r>
+      <w:proofErr w:type="spellStart"/>
+      <w:r>
+        <w:rPr>
+          <w:rFonts w:ascii="Bahnschrift SemiBold SemiConden" w:hAnsi="Bahnschrift SemiBold SemiConden"/>
+          <w:sz w:val="32"/>
+          <w:szCs w:val="32"/>
+        </w:rPr>
+        <w:t>index</w:t>
+      </w:r>
+      <w:proofErr w:type="spellEnd"/>
+      <w:r>
+        <w:rPr>
+          <w:rFonts w:ascii="Bahnschrift SemiBold SemiConden" w:hAnsi="Bahnschrift SemiBold SemiConden"/>
+          <w:sz w:val="32"/>
+          <w:szCs w:val="32"/>
+        </w:rPr>
+        <w:t>, Estructurándola y agregando imágenes.</w:t>
       </w:r>
     </w:p>
     <w:p>
@@ -769,7 +806,25 @@
           <w:sz w:val="32"/>
           <w:szCs w:val="32"/>
         </w:rPr>
-        <w:t>Añadimos iconos y imágenes de productos.</w:t>
+        <w:t xml:space="preserve">Añadimos iconos </w:t>
+      </w:r>
+      <w:proofErr w:type="spellStart"/>
+      <w:r>
+        <w:rPr>
+          <w:rFonts w:ascii="Bahnschrift SemiBold SemiConden" w:hAnsi="Bahnschrift SemiBold SemiConden"/>
+          <w:sz w:val="32"/>
+          <w:szCs w:val="32"/>
+        </w:rPr>
+        <w:t>y</w:t>
+      </w:r>
+      <w:proofErr w:type="spellEnd"/>
+      <w:r>
+        <w:rPr>
+          <w:rFonts w:ascii="Bahnschrift SemiBold SemiConden" w:hAnsi="Bahnschrift SemiBold SemiConden"/>
+          <w:sz w:val="32"/>
+          <w:szCs w:val="32"/>
+        </w:rPr>
+        <w:t xml:space="preserve"> imágenes de productos.</w:t>
       </w:r>
     </w:p>
     <w:p>
@@ -829,7 +884,23 @@
           <w:sz w:val="32"/>
           <w:szCs w:val="32"/>
         </w:rPr>
-        <w:t>Modificamos el archivo index.html, agregando la estructura semántica que vamos a seguir en todas las paginas.</w:t>
+        <w:t xml:space="preserve">Modificamos el archivo index.html, agregando la estructura semántica que vamos a seguir en todas las </w:t>
+      </w:r>
+      <w:r>
+        <w:rPr>
+          <w:rFonts w:ascii="Bahnschrift SemiBold SemiConden" w:hAnsi="Bahnschrift SemiBold SemiConden"/>
+          <w:sz w:val="32"/>
+          <w:szCs w:val="32"/>
+        </w:rPr>
+        <w:t>páginas</w:t>
+      </w:r>
+      <w:r>
+        <w:rPr>
+          <w:rFonts w:ascii="Bahnschrift SemiBold SemiConden" w:hAnsi="Bahnschrift SemiBold SemiConden"/>
+          <w:sz w:val="32"/>
+          <w:szCs w:val="32"/>
+        </w:rPr>
+        <w:t>.</w:t>
       </w:r>
     </w:p>
     <w:p>
@@ -899,7 +970,59 @@
           <w:sz w:val="32"/>
           <w:szCs w:val="32"/>
         </w:rPr>
-        <w:t>Agregando al css las fuentes.</w:t>
+        <w:t xml:space="preserve">Agregando al </w:t>
+      </w:r>
+      <w:proofErr w:type="spellStart"/>
+      <w:r>
+        <w:rPr>
+          <w:rFonts w:ascii="Bahnschrift SemiBold SemiConden" w:hAnsi="Bahnschrift SemiBold SemiConden"/>
+          <w:sz w:val="32"/>
+          <w:szCs w:val="32"/>
+        </w:rPr>
+        <w:t>css</w:t>
+      </w:r>
+      <w:proofErr w:type="spellEnd"/>
+      <w:r>
+        <w:rPr>
+          <w:rFonts w:ascii="Bahnschrift SemiBold SemiConden" w:hAnsi="Bahnschrift SemiBold SemiConden"/>
+          <w:sz w:val="32"/>
+          <w:szCs w:val="32"/>
+        </w:rPr>
+        <w:t xml:space="preserve"> las fuentes</w:t>
+      </w:r>
+      <w:r>
+        <w:rPr>
+          <w:rFonts w:ascii="Bahnschrift SemiBold SemiConden" w:hAnsi="Bahnschrift SemiBold SemiConden"/>
+          <w:sz w:val="32"/>
+          <w:szCs w:val="32"/>
+        </w:rPr>
+        <w:t xml:space="preserve"> con el Font-</w:t>
+      </w:r>
+      <w:proofErr w:type="spellStart"/>
+      <w:r>
+        <w:rPr>
+          <w:rFonts w:ascii="Bahnschrift SemiBold SemiConden" w:hAnsi="Bahnschrift SemiBold SemiConden"/>
+          <w:sz w:val="32"/>
+          <w:szCs w:val="32"/>
+        </w:rPr>
+        <w:t>face</w:t>
+      </w:r>
+      <w:proofErr w:type="spellEnd"/>
+      <w:r>
+        <w:rPr>
+          <w:rFonts w:ascii="Bahnschrift SemiBold SemiConden" w:hAnsi="Bahnschrift SemiBold SemiConden"/>
+          <w:sz w:val="32"/>
+          <w:szCs w:val="32"/>
+        </w:rPr>
+        <w:t>.</w:t>
+      </w:r>
+      <w:r>
+        <w:rPr>
+          <w:rFonts w:ascii="Bahnschrift SemiBold SemiConden" w:hAnsi="Bahnschrift SemiBold SemiConden"/>
+          <w:sz w:val="32"/>
+          <w:szCs w:val="32"/>
+        </w:rPr>
+        <w:t xml:space="preserve"> </w:t>
       </w:r>
     </w:p>
     <w:p>
@@ -979,28 +1102,314 @@
           <w:szCs w:val="32"/>
         </w:rPr>
       </w:pPr>
-    </w:p>
-    <w:p>
-      <w:pPr>
-        <w:rPr>
-          <w:rFonts w:ascii="Bahnschrift SemiBold SemiConden" w:hAnsi="Bahnschrift SemiBold SemiConden"/>
-          <w:sz w:val="32"/>
-          <w:szCs w:val="32"/>
-        </w:rPr>
-      </w:pPr>
-      <w:r>
-        <w:rPr>
-          <w:rFonts w:ascii="Bahnschrift SemiBold SemiConden" w:hAnsi="Bahnschrift SemiBold SemiConden"/>
-          <w:noProof/>
+      <w:r>
+        <w:rPr>
+          <w:rFonts w:ascii="Bahnschrift SemiBold SemiConden" w:hAnsi="Bahnschrift SemiBold SemiConden"/>
+          <w:sz w:val="32"/>
+          <w:szCs w:val="32"/>
+        </w:rPr>
+        <w:t xml:space="preserve">Para crear un buen diseño del </w:t>
+      </w:r>
+      <w:proofErr w:type="spellStart"/>
+      <w:r>
+        <w:rPr>
+          <w:rFonts w:ascii="Bahnschrift SemiBold SemiConden" w:hAnsi="Bahnschrift SemiBold SemiConden"/>
+          <w:sz w:val="32"/>
+          <w:szCs w:val="32"/>
+        </w:rPr>
+        <w:t>header</w:t>
+      </w:r>
+      <w:proofErr w:type="spellEnd"/>
+      <w:r>
+        <w:rPr>
+          <w:rFonts w:ascii="Bahnschrift SemiBold SemiConden" w:hAnsi="Bahnschrift SemiBold SemiConden"/>
+          <w:sz w:val="32"/>
+          <w:szCs w:val="32"/>
+        </w:rPr>
+        <w:t xml:space="preserve"> </w:t>
+      </w:r>
+      <w:r>
+        <w:rPr>
+          <w:rFonts w:ascii="Bahnschrift SemiBold SemiConden" w:hAnsi="Bahnschrift SemiBold SemiConden"/>
+          <w:sz w:val="32"/>
+          <w:szCs w:val="32"/>
+        </w:rPr>
+        <w:t>en</w:t>
+      </w:r>
+      <w:r>
+        <w:rPr>
+          <w:rFonts w:ascii="Bahnschrift SemiBold SemiConden" w:hAnsi="Bahnschrift SemiBold SemiConden"/>
+          <w:sz w:val="32"/>
+          <w:szCs w:val="32"/>
+        </w:rPr>
+        <w:t xml:space="preserve"> la </w:t>
+      </w:r>
+      <w:proofErr w:type="spellStart"/>
+      <w:r>
+        <w:rPr>
+          <w:rFonts w:ascii="Bahnschrift SemiBold SemiConden" w:hAnsi="Bahnschrift SemiBold SemiConden"/>
+          <w:sz w:val="32"/>
+          <w:szCs w:val="32"/>
+        </w:rPr>
+        <w:t>pagina</w:t>
+      </w:r>
+      <w:proofErr w:type="spellEnd"/>
+      <w:r>
+        <w:rPr>
+          <w:rFonts w:ascii="Bahnschrift SemiBold SemiConden" w:hAnsi="Bahnschrift SemiBold SemiConden"/>
+          <w:sz w:val="32"/>
+          <w:szCs w:val="32"/>
+        </w:rPr>
+        <w:t xml:space="preserve"> </w:t>
+      </w:r>
+      <w:proofErr w:type="spellStart"/>
+      <w:r>
+        <w:rPr>
+          <w:rFonts w:ascii="Bahnschrift SemiBold SemiConden" w:hAnsi="Bahnschrift SemiBold SemiConden"/>
+          <w:sz w:val="32"/>
+          <w:szCs w:val="32"/>
+        </w:rPr>
+        <w:t>index</w:t>
+      </w:r>
+      <w:proofErr w:type="spellEnd"/>
+      <w:r>
+        <w:rPr>
+          <w:rFonts w:ascii="Bahnschrift SemiBold SemiConden" w:hAnsi="Bahnschrift SemiBold SemiConden"/>
+          <w:sz w:val="32"/>
+          <w:szCs w:val="32"/>
+        </w:rPr>
+        <w:t xml:space="preserve">, tuvimos que agregar muchas etiquetas. Por </w:t>
+      </w:r>
+      <w:r>
+        <w:rPr>
+          <w:rFonts w:ascii="Bahnschrift SemiBold SemiConden" w:hAnsi="Bahnschrift SemiBold SemiConden"/>
+          <w:sz w:val="32"/>
+          <w:szCs w:val="32"/>
+        </w:rPr>
+        <w:t>ejemplo,</w:t>
+      </w:r>
+      <w:r>
+        <w:rPr>
+          <w:rFonts w:ascii="Bahnschrift SemiBold SemiConden" w:hAnsi="Bahnschrift SemiBold SemiConden"/>
+          <w:sz w:val="32"/>
+          <w:szCs w:val="32"/>
+        </w:rPr>
+        <w:t xml:space="preserve"> tuvimos que modificar </w:t>
+      </w:r>
+      <w:r>
+        <w:rPr>
+          <w:rFonts w:ascii="Bahnschrift SemiBold SemiConden" w:hAnsi="Bahnschrift SemiBold SemiConden"/>
+          <w:sz w:val="32"/>
+          <w:szCs w:val="32"/>
+        </w:rPr>
+        <w:t>el .</w:t>
+      </w:r>
+      <w:proofErr w:type="spellStart"/>
+      <w:r>
+        <w:rPr>
+          <w:rFonts w:ascii="Bahnschrift SemiBold SemiConden" w:hAnsi="Bahnschrift SemiBold SemiConden"/>
+          <w:sz w:val="32"/>
+          <w:szCs w:val="32"/>
+        </w:rPr>
+        <w:t>top.bar</w:t>
+      </w:r>
+      <w:proofErr w:type="spellEnd"/>
+      <w:r>
+        <w:rPr>
+          <w:rFonts w:ascii="Bahnschrift SemiBold SemiConden" w:hAnsi="Bahnschrift SemiBold SemiConden"/>
+          <w:sz w:val="32"/>
+          <w:szCs w:val="32"/>
+        </w:rPr>
+        <w:t xml:space="preserve">, la barra de anuncios, los iconos que funcionan como enlaces, también el </w:t>
+      </w:r>
+      <w:proofErr w:type="spellStart"/>
+      <w:r>
+        <w:rPr>
+          <w:rFonts w:ascii="Bahnschrift SemiBold SemiConden" w:hAnsi="Bahnschrift SemiBold SemiConden"/>
+          <w:sz w:val="32"/>
+          <w:szCs w:val="32"/>
+        </w:rPr>
+        <w:t>nav_bar</w:t>
+      </w:r>
+      <w:proofErr w:type="spellEnd"/>
+      <w:r>
+        <w:rPr>
+          <w:rFonts w:ascii="Bahnschrift SemiBold SemiConden" w:hAnsi="Bahnschrift SemiBold SemiConden"/>
+          <w:sz w:val="32"/>
+          <w:szCs w:val="32"/>
+        </w:rPr>
+        <w:t xml:space="preserve">. Que es lo que sobresale de abajo del </w:t>
+      </w:r>
+      <w:proofErr w:type="spellStart"/>
+      <w:r>
+        <w:rPr>
+          <w:rFonts w:ascii="Bahnschrift SemiBold SemiConden" w:hAnsi="Bahnschrift SemiBold SemiConden"/>
+          <w:sz w:val="32"/>
+          <w:szCs w:val="32"/>
+        </w:rPr>
+        <w:t>top.bar</w:t>
+      </w:r>
+      <w:proofErr w:type="spellEnd"/>
+      <w:r>
+        <w:rPr>
+          <w:rFonts w:ascii="Bahnschrift SemiBold SemiConden" w:hAnsi="Bahnschrift SemiBold SemiConden"/>
+          <w:sz w:val="32"/>
+          <w:szCs w:val="32"/>
+        </w:rPr>
+        <w:t>.</w:t>
+      </w:r>
+    </w:p>
+    <w:p>
+      <w:pPr>
+        <w:rPr>
+          <w:rFonts w:ascii="Bahnschrift SemiBold SemiConden" w:hAnsi="Bahnschrift SemiBold SemiConden"/>
+          <w:sz w:val="32"/>
+          <w:szCs w:val="32"/>
+        </w:rPr>
+      </w:pPr>
+      <w:r>
+        <w:rPr>
+          <w:rFonts w:ascii="Bahnschrift SemiBold SemiConden" w:hAnsi="Bahnschrift SemiBold SemiConden"/>
           <w:sz w:val="32"/>
           <w:szCs w:val="32"/>
         </w:rPr>
         <w:lastRenderedPageBreak/>
+        <w:t xml:space="preserve">Y en si tuvimos que modificar el color, modificar el </w:t>
+      </w:r>
+      <w:proofErr w:type="spellStart"/>
+      <w:r>
+        <w:rPr>
+          <w:rFonts w:ascii="Bahnschrift SemiBold SemiConden" w:hAnsi="Bahnschrift SemiBold SemiConden"/>
+          <w:sz w:val="32"/>
+          <w:szCs w:val="32"/>
+        </w:rPr>
+        <w:t>padding</w:t>
+      </w:r>
+      <w:proofErr w:type="spellEnd"/>
+      <w:r>
+        <w:rPr>
+          <w:rFonts w:ascii="Bahnschrift SemiBold SemiConden" w:hAnsi="Bahnschrift SemiBold SemiConden"/>
+          <w:sz w:val="32"/>
+          <w:szCs w:val="32"/>
+        </w:rPr>
+        <w:t xml:space="preserve">, el </w:t>
+      </w:r>
+      <w:proofErr w:type="spellStart"/>
+      <w:r>
+        <w:rPr>
+          <w:rFonts w:ascii="Bahnschrift SemiBold SemiConden" w:hAnsi="Bahnschrift SemiBold SemiConden"/>
+          <w:sz w:val="32"/>
+          <w:szCs w:val="32"/>
+        </w:rPr>
+        <w:t>margin</w:t>
+      </w:r>
+      <w:proofErr w:type="spellEnd"/>
+      <w:r>
+        <w:rPr>
+          <w:rFonts w:ascii="Bahnschrift SemiBold SemiConden" w:hAnsi="Bahnschrift SemiBold SemiConden"/>
+          <w:sz w:val="32"/>
+          <w:szCs w:val="32"/>
+        </w:rPr>
+        <w:t xml:space="preserve">, </w:t>
+      </w:r>
+      <w:r>
+        <w:rPr>
+          <w:rFonts w:ascii="Bahnschrift SemiBold SemiConden" w:hAnsi="Bahnschrift SemiBold SemiConden"/>
+          <w:sz w:val="32"/>
+          <w:szCs w:val="32"/>
+        </w:rPr>
+        <w:t xml:space="preserve">utilizamos </w:t>
+      </w:r>
+      <w:proofErr w:type="spellStart"/>
+      <w:r>
+        <w:rPr>
+          <w:rFonts w:ascii="Bahnschrift SemiBold SemiConden" w:hAnsi="Bahnschrift SemiBold SemiConden"/>
+          <w:sz w:val="32"/>
+          <w:szCs w:val="32"/>
+        </w:rPr>
+        <w:t>display</w:t>
+      </w:r>
+      <w:proofErr w:type="spellEnd"/>
+      <w:r>
+        <w:rPr>
+          <w:rFonts w:ascii="Bahnschrift SemiBold SemiConden" w:hAnsi="Bahnschrift SemiBold SemiConden"/>
+          <w:sz w:val="32"/>
+          <w:szCs w:val="32"/>
+        </w:rPr>
+        <w:t xml:space="preserve"> </w:t>
+      </w:r>
+      <w:proofErr w:type="spellStart"/>
+      <w:r>
+        <w:rPr>
+          <w:rFonts w:ascii="Bahnschrift SemiBold SemiConden" w:hAnsi="Bahnschrift SemiBold SemiConden"/>
+          <w:sz w:val="32"/>
+          <w:szCs w:val="32"/>
+        </w:rPr>
+        <w:t>flex</w:t>
+      </w:r>
+      <w:proofErr w:type="spellEnd"/>
+      <w:r>
+        <w:rPr>
+          <w:rFonts w:ascii="Bahnschrift SemiBold SemiConden" w:hAnsi="Bahnschrift SemiBold SemiConden"/>
+          <w:sz w:val="32"/>
+          <w:szCs w:val="32"/>
+        </w:rPr>
+        <w:t xml:space="preserve"> para apilar los iconos</w:t>
+      </w:r>
+      <w:r>
+        <w:rPr>
+          <w:rFonts w:ascii="Bahnschrift SemiBold SemiConden" w:hAnsi="Bahnschrift SemiBold SemiConden"/>
+          <w:sz w:val="32"/>
+          <w:szCs w:val="32"/>
+        </w:rPr>
+        <w:t xml:space="preserve"> en fila</w:t>
+      </w:r>
+      <w:r>
+        <w:rPr>
+          <w:rFonts w:ascii="Bahnschrift SemiBold SemiConden" w:hAnsi="Bahnschrift SemiBold SemiConden"/>
+          <w:sz w:val="32"/>
+          <w:szCs w:val="32"/>
+        </w:rPr>
+        <w:t xml:space="preserve">, gap para el espacio entre estos, también modificamos el tamaño de las letras y su color, </w:t>
+      </w:r>
+      <w:proofErr w:type="spellStart"/>
+      <w:r>
+        <w:rPr>
+          <w:rFonts w:ascii="Bahnschrift SemiBold SemiConden" w:hAnsi="Bahnschrift SemiBold SemiConden"/>
+          <w:sz w:val="32"/>
+          <w:szCs w:val="32"/>
+        </w:rPr>
+        <w:t>etc</w:t>
+      </w:r>
+      <w:proofErr w:type="spellEnd"/>
+      <w:r>
+        <w:rPr>
+          <w:rFonts w:ascii="Bahnschrift SemiBold SemiConden" w:hAnsi="Bahnschrift SemiBold SemiConden"/>
+          <w:sz w:val="32"/>
+          <w:szCs w:val="32"/>
+        </w:rPr>
+        <w:t xml:space="preserve">  y agregamos la animación de barra de anuncios.</w:t>
+      </w:r>
+    </w:p>
+    <w:p>
+      <w:pPr>
+        <w:rPr>
+          <w:rFonts w:ascii="Bahnschrift SemiBold SemiConden" w:hAnsi="Bahnschrift SemiBold SemiConden"/>
+          <w:sz w:val="32"/>
+          <w:szCs w:val="32"/>
+        </w:rPr>
+      </w:pPr>
+      <w:r>
+        <w:rPr>
+          <w:rFonts w:ascii="Bahnschrift SemiBold SemiConden" w:hAnsi="Bahnschrift SemiBold SemiConden"/>
+          <w:sz w:val="32"/>
+          <w:szCs w:val="32"/>
+        </w:rPr>
         <w:drawing>
-          <wp:inline distT="0" distB="0" distL="0" distR="0" wp14:anchorId="38FF2283" wp14:editId="34E1184B">
-            <wp:extent cx="5400040" cy="1161415"/>
-            <wp:effectExtent l="0" t="0" r="0" b="635"/>
-            <wp:docPr id="1595599040" name="Imagen 1"/>
+          <wp:inline distT="0" distB="0" distL="0" distR="0" wp14:anchorId="01AABBA0" wp14:editId="2DEFCD57">
+            <wp:extent cx="5400040" cy="979170"/>
+            <wp:effectExtent l="0" t="0" r="0" b="0"/>
+            <wp:docPr id="554187621" name="Imagen 1"/>
             <wp:cNvGraphicFramePr>
               <a:graphicFrameLocks xmlns:a="http://schemas.openxmlformats.org/drawingml/2006/main" noChangeAspect="1"/>
             </wp:cNvGraphicFramePr>
@@ -1008,7 +1417,7 @@
               <a:graphicData uri="http://schemas.openxmlformats.org/drawingml/2006/picture">
                 <pic:pic xmlns:pic="http://schemas.openxmlformats.org/drawingml/2006/picture">
                   <pic:nvPicPr>
-                    <pic:cNvPr id="1595599040" name=""/>
+                    <pic:cNvPr id="554187621" name=""/>
                     <pic:cNvPicPr/>
                   </pic:nvPicPr>
                   <pic:blipFill>
@@ -1020,7 +1429,7 @@
                   <pic:spPr>
                     <a:xfrm>
                       <a:off x="0" y="0"/>
-                      <a:ext cx="5400040" cy="1161415"/>
+                      <a:ext cx="5400040" cy="979170"/>
                     </a:xfrm>
                     <a:prstGeom prst="rect">
                       <a:avLst/>
@@ -1047,29 +1456,64 @@
           <w:sz w:val="32"/>
           <w:szCs w:val="32"/>
         </w:rPr>
-        <w:t>Progreso de la página.</w:t>
-      </w:r>
-    </w:p>
-    <w:p>
-      <w:pPr>
-        <w:rPr>
-          <w:rFonts w:ascii="Bahnschrift SemiBold SemiConden" w:hAnsi="Bahnschrift SemiBold SemiConden"/>
-          <w:sz w:val="32"/>
-          <w:szCs w:val="32"/>
-        </w:rPr>
-      </w:pPr>
-    </w:p>
-    <w:p>
-      <w:pPr>
-        <w:rPr>
-          <w:rFonts w:ascii="Bahnschrift SemiBold SemiConden" w:hAnsi="Bahnschrift SemiBold SemiConden"/>
-          <w:sz w:val="32"/>
-          <w:szCs w:val="32"/>
-        </w:rPr>
-      </w:pPr>
-      <w:r>
-        <w:rPr>
-          <w:rFonts w:ascii="Bahnschrift SemiBold SemiConden" w:hAnsi="Bahnschrift SemiBold SemiConden"/>
+        <w:t>Progreso de</w:t>
+      </w:r>
+      <w:r>
+        <w:rPr>
+          <w:rFonts w:ascii="Bahnschrift SemiBold SemiConden" w:hAnsi="Bahnschrift SemiBold SemiConden"/>
+          <w:sz w:val="32"/>
+          <w:szCs w:val="32"/>
+        </w:rPr>
+        <w:t xml:space="preserve">l </w:t>
+      </w:r>
+      <w:proofErr w:type="spellStart"/>
+      <w:r>
+        <w:rPr>
+          <w:rFonts w:ascii="Bahnschrift SemiBold SemiConden" w:hAnsi="Bahnschrift SemiBold SemiConden"/>
+          <w:sz w:val="32"/>
+          <w:szCs w:val="32"/>
+        </w:rPr>
+        <w:t>header</w:t>
+      </w:r>
+      <w:proofErr w:type="spellEnd"/>
+      <w:r>
+        <w:rPr>
+          <w:rFonts w:ascii="Bahnschrift SemiBold SemiConden" w:hAnsi="Bahnschrift SemiBold SemiConden"/>
+          <w:sz w:val="32"/>
+          <w:szCs w:val="32"/>
+        </w:rPr>
+        <w:t xml:space="preserve"> de</w:t>
+      </w:r>
+      <w:r>
+        <w:rPr>
+          <w:rFonts w:ascii="Bahnschrift SemiBold SemiConden" w:hAnsi="Bahnschrift SemiBold SemiConden"/>
+          <w:sz w:val="32"/>
+          <w:szCs w:val="32"/>
+        </w:rPr>
+        <w:t xml:space="preserve"> la página.</w:t>
+      </w:r>
+    </w:p>
+    <w:p>
+      <w:pPr>
+        <w:rPr>
+          <w:rFonts w:ascii="Bahnschrift SemiBold SemiConden" w:hAnsi="Bahnschrift SemiBold SemiConden"/>
+          <w:sz w:val="32"/>
+          <w:szCs w:val="32"/>
+        </w:rPr>
+      </w:pPr>
+    </w:p>
+    <w:p>
+      <w:pPr>
+        <w:rPr>
+          <w:rFonts w:ascii="Bahnschrift SemiBold SemiConden" w:hAnsi="Bahnschrift SemiBold SemiConden"/>
+          <w:sz w:val="32"/>
+          <w:szCs w:val="32"/>
+        </w:rPr>
+      </w:pPr>
+      <w:r>
+        <w:rPr>
+          <w:rFonts w:ascii="Bahnschrift SemiBold SemiConden" w:hAnsi="Bahnschrift SemiBold SemiConden"/>
+          <w:noProof/>
           <w:sz w:val="32"/>
           <w:szCs w:val="32"/>
         </w:rPr>
@@ -1136,8 +1580,825 @@
         </w:rPr>
       </w:pPr>
     </w:p>
+    <w:p>
+      <w:pPr>
+        <w:rPr>
+          <w:rFonts w:ascii="Bahnschrift SemiBold SemiConden" w:hAnsi="Bahnschrift SemiBold SemiConden"/>
+          <w:sz w:val="32"/>
+          <w:szCs w:val="32"/>
+        </w:rPr>
+      </w:pPr>
+    </w:p>
+    <w:p>
+      <w:pPr>
+        <w:jc w:val="center"/>
+        <w:rPr>
+          <w:rFonts w:ascii="Bahnschrift SemiBold SemiConden" w:hAnsi="Bahnschrift SemiBold SemiConden"/>
+          <w:sz w:val="32"/>
+          <w:szCs w:val="32"/>
+        </w:rPr>
+      </w:pPr>
+      <w:r>
+        <w:rPr>
+          <w:rFonts w:ascii="Bahnschrift SemiBold SemiConden" w:hAnsi="Bahnschrift SemiBold SemiConden"/>
+          <w:sz w:val="32"/>
+          <w:szCs w:val="32"/>
+        </w:rPr>
+        <w:lastRenderedPageBreak/>
+        <w:drawing>
+          <wp:inline distT="0" distB="0" distL="0" distR="0" wp14:anchorId="4BF9688F" wp14:editId="213AA245">
+            <wp:extent cx="3995531" cy="3291239"/>
+            <wp:effectExtent l="0" t="0" r="5080" b="4445"/>
+            <wp:docPr id="1095893737" name="Imagen 1"/>
+            <wp:cNvGraphicFramePr>
+              <a:graphicFrameLocks xmlns:a="http://schemas.openxmlformats.org/drawingml/2006/main" noChangeAspect="1"/>
+            </wp:cNvGraphicFramePr>
+            <a:graphic xmlns:a="http://schemas.openxmlformats.org/drawingml/2006/main">
+              <a:graphicData uri="http://schemas.openxmlformats.org/drawingml/2006/picture">
+                <pic:pic xmlns:pic="http://schemas.openxmlformats.org/drawingml/2006/picture">
+                  <pic:nvPicPr>
+                    <pic:cNvPr id="1095893737" name=""/>
+                    <pic:cNvPicPr/>
+                  </pic:nvPicPr>
+                  <pic:blipFill>
+                    <a:blip r:embed="rId18"/>
+                    <a:stretch>
+                      <a:fillRect/>
+                    </a:stretch>
+                  </pic:blipFill>
+                  <pic:spPr>
+                    <a:xfrm>
+                      <a:off x="0" y="0"/>
+                      <a:ext cx="3999537" cy="3294539"/>
+                    </a:xfrm>
+                    <a:prstGeom prst="rect">
+                      <a:avLst/>
+                    </a:prstGeom>
+                  </pic:spPr>
+                </pic:pic>
+              </a:graphicData>
+            </a:graphic>
+          </wp:inline>
+        </w:drawing>
+      </w:r>
+    </w:p>
+    <w:p>
+      <w:pPr>
+        <w:jc w:val="center"/>
+        <w:rPr>
+          <w:rFonts w:ascii="Bahnschrift SemiBold SemiConden" w:hAnsi="Bahnschrift SemiBold SemiConden"/>
+          <w:sz w:val="32"/>
+          <w:szCs w:val="32"/>
+        </w:rPr>
+      </w:pPr>
+      <w:r>
+        <w:rPr>
+          <w:rFonts w:ascii="Bahnschrift SemiBold SemiConden" w:hAnsi="Bahnschrift SemiBold SemiConden"/>
+          <w:sz w:val="32"/>
+          <w:szCs w:val="32"/>
+        </w:rPr>
+        <w:t xml:space="preserve">Armamos la estructura en el </w:t>
+      </w:r>
+      <w:proofErr w:type="spellStart"/>
+      <w:r>
+        <w:rPr>
+          <w:rFonts w:ascii="Bahnschrift SemiBold SemiConden" w:hAnsi="Bahnschrift SemiBold SemiConden"/>
+          <w:sz w:val="32"/>
+          <w:szCs w:val="32"/>
+        </w:rPr>
+        <w:t>html</w:t>
+      </w:r>
+      <w:proofErr w:type="spellEnd"/>
+      <w:r>
+        <w:rPr>
+          <w:rFonts w:ascii="Bahnschrift SemiBold SemiConden" w:hAnsi="Bahnschrift SemiBold SemiConden"/>
+          <w:sz w:val="32"/>
+          <w:szCs w:val="32"/>
+        </w:rPr>
+        <w:t xml:space="preserve"> de </w:t>
+      </w:r>
+      <w:proofErr w:type="spellStart"/>
+      <w:r>
+        <w:rPr>
+          <w:rFonts w:ascii="Bahnschrift SemiBold SemiConden" w:hAnsi="Bahnschrift SemiBold SemiConden"/>
+          <w:sz w:val="32"/>
+          <w:szCs w:val="32"/>
+        </w:rPr>
+        <w:t>sign_up</w:t>
+      </w:r>
+      <w:proofErr w:type="spellEnd"/>
+    </w:p>
+    <w:p>
+      <w:pPr>
+        <w:jc w:val="center"/>
+        <w:rPr>
+          <w:rFonts w:ascii="Bahnschrift SemiBold SemiConden" w:hAnsi="Bahnschrift SemiBold SemiConden"/>
+          <w:sz w:val="32"/>
+          <w:szCs w:val="32"/>
+        </w:rPr>
+      </w:pPr>
+    </w:p>
+    <w:p>
+      <w:pPr>
+        <w:jc w:val="center"/>
+        <w:rPr>
+          <w:rFonts w:ascii="Bahnschrift SemiBold SemiConden" w:hAnsi="Bahnschrift SemiBold SemiConden"/>
+          <w:sz w:val="32"/>
+          <w:szCs w:val="32"/>
+        </w:rPr>
+      </w:pPr>
+      <w:r>
+        <w:rPr>
+          <w:rFonts w:ascii="Bahnschrift SemiBold SemiConden" w:hAnsi="Bahnschrift SemiBold SemiConden"/>
+          <w:sz w:val="32"/>
+          <w:szCs w:val="32"/>
+        </w:rPr>
+        <w:drawing>
+          <wp:inline distT="0" distB="0" distL="0" distR="0" wp14:anchorId="515613FB" wp14:editId="6E496643">
+            <wp:extent cx="2810267" cy="809738"/>
+            <wp:effectExtent l="0" t="0" r="9525" b="9525"/>
+            <wp:docPr id="1293137257" name="Imagen 1"/>
+            <wp:cNvGraphicFramePr>
+              <a:graphicFrameLocks xmlns:a="http://schemas.openxmlformats.org/drawingml/2006/main" noChangeAspect="1"/>
+            </wp:cNvGraphicFramePr>
+            <a:graphic xmlns:a="http://schemas.openxmlformats.org/drawingml/2006/main">
+              <a:graphicData uri="http://schemas.openxmlformats.org/drawingml/2006/picture">
+                <pic:pic xmlns:pic="http://schemas.openxmlformats.org/drawingml/2006/picture">
+                  <pic:nvPicPr>
+                    <pic:cNvPr id="1293137257" name=""/>
+                    <pic:cNvPicPr/>
+                  </pic:nvPicPr>
+                  <pic:blipFill>
+                    <a:blip r:embed="rId19"/>
+                    <a:stretch>
+                      <a:fillRect/>
+                    </a:stretch>
+                  </pic:blipFill>
+                  <pic:spPr>
+                    <a:xfrm>
+                      <a:off x="0" y="0"/>
+                      <a:ext cx="2810267" cy="809738"/>
+                    </a:xfrm>
+                    <a:prstGeom prst="rect">
+                      <a:avLst/>
+                    </a:prstGeom>
+                  </pic:spPr>
+                </pic:pic>
+              </a:graphicData>
+            </a:graphic>
+          </wp:inline>
+        </w:drawing>
+      </w:r>
+    </w:p>
+    <w:p>
+      <w:pPr>
+        <w:jc w:val="center"/>
+        <w:rPr>
+          <w:rFonts w:ascii="Bahnschrift SemiBold SemiConden" w:hAnsi="Bahnschrift SemiBold SemiConden"/>
+          <w:sz w:val="32"/>
+          <w:szCs w:val="32"/>
+        </w:rPr>
+      </w:pPr>
+      <w:r>
+        <w:rPr>
+          <w:rFonts w:ascii="Bahnschrift SemiBold SemiConden" w:hAnsi="Bahnschrift SemiBold SemiConden"/>
+          <w:sz w:val="32"/>
+          <w:szCs w:val="32"/>
+        </w:rPr>
+        <w:t xml:space="preserve">Creamos 2 nuevos archivos de </w:t>
+      </w:r>
+      <w:r>
+        <w:rPr>
+          <w:rFonts w:ascii="Bahnschrift SemiBold SemiConden" w:hAnsi="Bahnschrift SemiBold SemiConden"/>
+          <w:sz w:val="32"/>
+          <w:szCs w:val="32"/>
+        </w:rPr>
+        <w:t>e</w:t>
+      </w:r>
+      <w:r>
+        <w:rPr>
+          <w:rFonts w:ascii="Bahnschrift SemiBold SemiConden" w:hAnsi="Bahnschrift SemiBold SemiConden"/>
+          <w:sz w:val="32"/>
+          <w:szCs w:val="32"/>
+        </w:rPr>
+        <w:t>stilo.</w:t>
+      </w:r>
+    </w:p>
+    <w:p>
+      <w:pPr>
+        <w:jc w:val="center"/>
+        <w:rPr>
+          <w:rFonts w:ascii="Bahnschrift SemiBold SemiConden" w:hAnsi="Bahnschrift SemiBold SemiConden"/>
+          <w:sz w:val="32"/>
+          <w:szCs w:val="32"/>
+        </w:rPr>
+      </w:pPr>
+      <w:r>
+        <w:rPr>
+          <w:rFonts w:ascii="Bahnschrift SemiBold SemiConden" w:hAnsi="Bahnschrift SemiBold SemiConden"/>
+          <w:sz w:val="32"/>
+          <w:szCs w:val="32"/>
+        </w:rPr>
+        <w:lastRenderedPageBreak/>
+        <w:drawing>
+          <wp:inline distT="0" distB="0" distL="0" distR="0" wp14:anchorId="6FCDF26D" wp14:editId="7A03D4E8">
+            <wp:extent cx="3965713" cy="3481191"/>
+            <wp:effectExtent l="0" t="0" r="0" b="5080"/>
+            <wp:docPr id="34892874" name="Imagen 1"/>
+            <wp:cNvGraphicFramePr>
+              <a:graphicFrameLocks xmlns:a="http://schemas.openxmlformats.org/drawingml/2006/main" noChangeAspect="1"/>
+            </wp:cNvGraphicFramePr>
+            <a:graphic xmlns:a="http://schemas.openxmlformats.org/drawingml/2006/main">
+              <a:graphicData uri="http://schemas.openxmlformats.org/drawingml/2006/picture">
+                <pic:pic xmlns:pic="http://schemas.openxmlformats.org/drawingml/2006/picture">
+                  <pic:nvPicPr>
+                    <pic:cNvPr id="34892874" name=""/>
+                    <pic:cNvPicPr/>
+                  </pic:nvPicPr>
+                  <pic:blipFill>
+                    <a:blip r:embed="rId20"/>
+                    <a:stretch>
+                      <a:fillRect/>
+                    </a:stretch>
+                  </pic:blipFill>
+                  <pic:spPr>
+                    <a:xfrm>
+                      <a:off x="0" y="0"/>
+                      <a:ext cx="3969306" cy="3484345"/>
+                    </a:xfrm>
+                    <a:prstGeom prst="rect">
+                      <a:avLst/>
+                    </a:prstGeom>
+                  </pic:spPr>
+                </pic:pic>
+              </a:graphicData>
+            </a:graphic>
+          </wp:inline>
+        </w:drawing>
+      </w:r>
+    </w:p>
+    <w:p>
+      <w:pPr>
+        <w:jc w:val="center"/>
+        <w:rPr>
+          <w:rFonts w:ascii="Bahnschrift SemiBold SemiConden" w:hAnsi="Bahnschrift SemiBold SemiConden"/>
+          <w:sz w:val="32"/>
+          <w:szCs w:val="32"/>
+        </w:rPr>
+      </w:pPr>
+      <w:r>
+        <w:rPr>
+          <w:rFonts w:ascii="Bahnschrift SemiBold SemiConden" w:hAnsi="Bahnschrift SemiBold SemiConden"/>
+          <w:sz w:val="32"/>
+          <w:szCs w:val="32"/>
+        </w:rPr>
+        <w:drawing>
+          <wp:inline distT="0" distB="0" distL="0" distR="0" wp14:anchorId="285A816F" wp14:editId="73B94BB6">
+            <wp:extent cx="4035287" cy="3817960"/>
+            <wp:effectExtent l="0" t="0" r="3810" b="0"/>
+            <wp:docPr id="866953701" name="Imagen 1"/>
+            <wp:cNvGraphicFramePr>
+              <a:graphicFrameLocks xmlns:a="http://schemas.openxmlformats.org/drawingml/2006/main" noChangeAspect="1"/>
+            </wp:cNvGraphicFramePr>
+            <a:graphic xmlns:a="http://schemas.openxmlformats.org/drawingml/2006/main">
+              <a:graphicData uri="http://schemas.openxmlformats.org/drawingml/2006/picture">
+                <pic:pic xmlns:pic="http://schemas.openxmlformats.org/drawingml/2006/picture">
+                  <pic:nvPicPr>
+                    <pic:cNvPr id="866953701" name=""/>
+                    <pic:cNvPicPr/>
+                  </pic:nvPicPr>
+                  <pic:blipFill>
+                    <a:blip r:embed="rId21"/>
+                    <a:stretch>
+                      <a:fillRect/>
+                    </a:stretch>
+                  </pic:blipFill>
+                  <pic:spPr>
+                    <a:xfrm>
+                      <a:off x="0" y="0"/>
+                      <a:ext cx="4057559" cy="3839032"/>
+                    </a:xfrm>
+                    <a:prstGeom prst="rect">
+                      <a:avLst/>
+                    </a:prstGeom>
+                  </pic:spPr>
+                </pic:pic>
+              </a:graphicData>
+            </a:graphic>
+          </wp:inline>
+        </w:drawing>
+      </w:r>
+    </w:p>
+    <w:p>
+      <w:pPr>
+        <w:jc w:val="center"/>
+        <w:rPr>
+          <w:rFonts w:ascii="Bahnschrift SemiBold SemiConden" w:hAnsi="Bahnschrift SemiBold SemiConden"/>
+          <w:sz w:val="32"/>
+          <w:szCs w:val="32"/>
+        </w:rPr>
+      </w:pPr>
+      <w:r>
+        <w:rPr>
+          <w:rFonts w:ascii="Bahnschrift SemiBold SemiConden" w:hAnsi="Bahnschrift SemiBold SemiConden"/>
+          <w:sz w:val="32"/>
+          <w:szCs w:val="32"/>
+        </w:rPr>
+        <w:lastRenderedPageBreak/>
+        <w:drawing>
+          <wp:inline distT="0" distB="0" distL="0" distR="0" wp14:anchorId="7762B723" wp14:editId="06FEDEB6">
+            <wp:extent cx="3597965" cy="3893110"/>
+            <wp:effectExtent l="0" t="0" r="2540" b="0"/>
+            <wp:docPr id="1184111788" name="Imagen 1"/>
+            <wp:cNvGraphicFramePr>
+              <a:graphicFrameLocks xmlns:a="http://schemas.openxmlformats.org/drawingml/2006/main" noChangeAspect="1"/>
+            </wp:cNvGraphicFramePr>
+            <a:graphic xmlns:a="http://schemas.openxmlformats.org/drawingml/2006/main">
+              <a:graphicData uri="http://schemas.openxmlformats.org/drawingml/2006/picture">
+                <pic:pic xmlns:pic="http://schemas.openxmlformats.org/drawingml/2006/picture">
+                  <pic:nvPicPr>
+                    <pic:cNvPr id="1184111788" name=""/>
+                    <pic:cNvPicPr/>
+                  </pic:nvPicPr>
+                  <pic:blipFill>
+                    <a:blip r:embed="rId22"/>
+                    <a:stretch>
+                      <a:fillRect/>
+                    </a:stretch>
+                  </pic:blipFill>
+                  <pic:spPr>
+                    <a:xfrm>
+                      <a:off x="0" y="0"/>
+                      <a:ext cx="3610222" cy="3906373"/>
+                    </a:xfrm>
+                    <a:prstGeom prst="rect">
+                      <a:avLst/>
+                    </a:prstGeom>
+                  </pic:spPr>
+                </pic:pic>
+              </a:graphicData>
+            </a:graphic>
+          </wp:inline>
+        </w:drawing>
+      </w:r>
+    </w:p>
+    <w:p>
+      <w:pPr>
+        <w:jc w:val="center"/>
+        <w:rPr>
+          <w:rFonts w:ascii="Bahnschrift SemiBold SemiConden" w:hAnsi="Bahnschrift SemiBold SemiConden"/>
+          <w:sz w:val="32"/>
+          <w:szCs w:val="32"/>
+        </w:rPr>
+      </w:pPr>
+      <w:r>
+        <w:rPr>
+          <w:rFonts w:ascii="Bahnschrift SemiBold SemiConden" w:hAnsi="Bahnschrift SemiBold SemiConden"/>
+          <w:sz w:val="32"/>
+          <w:szCs w:val="32"/>
+        </w:rPr>
+        <w:t>Editamos el archivo</w:t>
+      </w:r>
+      <w:r>
+        <w:rPr>
+          <w:rFonts w:ascii="Bahnschrift SemiBold SemiConden" w:hAnsi="Bahnschrift SemiBold SemiConden"/>
+          <w:sz w:val="32"/>
+          <w:szCs w:val="32"/>
+        </w:rPr>
+        <w:t xml:space="preserve">, modificando las diferentes etiquetas como h2, </w:t>
+      </w:r>
+      <w:proofErr w:type="spellStart"/>
+      <w:r>
+        <w:rPr>
+          <w:rFonts w:ascii="Bahnschrift SemiBold SemiConden" w:hAnsi="Bahnschrift SemiBold SemiConden"/>
+          <w:sz w:val="32"/>
+          <w:szCs w:val="32"/>
+        </w:rPr>
+        <w:t>botton</w:t>
+      </w:r>
+      <w:proofErr w:type="spellEnd"/>
+      <w:r>
+        <w:rPr>
+          <w:rFonts w:ascii="Bahnschrift SemiBold SemiConden" w:hAnsi="Bahnschrift SemiBold SemiConden"/>
+          <w:sz w:val="32"/>
+          <w:szCs w:val="32"/>
+        </w:rPr>
+        <w:t xml:space="preserve">, y a los contenedores un color, </w:t>
+      </w:r>
+      <w:proofErr w:type="spellStart"/>
+      <w:r>
+        <w:rPr>
+          <w:rFonts w:ascii="Bahnschrift SemiBold SemiConden" w:hAnsi="Bahnschrift SemiBold SemiConden"/>
+          <w:sz w:val="32"/>
+          <w:szCs w:val="32"/>
+        </w:rPr>
+        <w:t>border</w:t>
+      </w:r>
+      <w:proofErr w:type="spellEnd"/>
+      <w:r>
+        <w:rPr>
+          <w:rFonts w:ascii="Bahnschrift SemiBold SemiConden" w:hAnsi="Bahnschrift SemiBold SemiConden"/>
+          <w:sz w:val="32"/>
+          <w:szCs w:val="32"/>
+        </w:rPr>
+        <w:t xml:space="preserve"> </w:t>
+      </w:r>
+      <w:proofErr w:type="spellStart"/>
+      <w:r>
+        <w:rPr>
+          <w:rFonts w:ascii="Bahnschrift SemiBold SemiConden" w:hAnsi="Bahnschrift SemiBold SemiConden"/>
+          <w:sz w:val="32"/>
+          <w:szCs w:val="32"/>
+        </w:rPr>
+        <w:t>radius</w:t>
+      </w:r>
+      <w:proofErr w:type="spellEnd"/>
+      <w:r>
+        <w:rPr>
+          <w:rFonts w:ascii="Bahnschrift SemiBold SemiConden" w:hAnsi="Bahnschrift SemiBold SemiConden"/>
+          <w:sz w:val="32"/>
+          <w:szCs w:val="32"/>
+        </w:rPr>
+        <w:t xml:space="preserve">, </w:t>
+      </w:r>
+      <w:proofErr w:type="spellStart"/>
+      <w:r>
+        <w:rPr>
+          <w:rFonts w:ascii="Bahnschrift SemiBold SemiConden" w:hAnsi="Bahnschrift SemiBold SemiConden"/>
+          <w:sz w:val="32"/>
+          <w:szCs w:val="32"/>
+        </w:rPr>
+        <w:t>margin</w:t>
+      </w:r>
+      <w:proofErr w:type="spellEnd"/>
+      <w:r>
+        <w:rPr>
+          <w:rFonts w:ascii="Bahnschrift SemiBold SemiConden" w:hAnsi="Bahnschrift SemiBold SemiConden"/>
+          <w:sz w:val="32"/>
+          <w:szCs w:val="32"/>
+        </w:rPr>
+        <w:t xml:space="preserve">, </w:t>
+      </w:r>
+      <w:proofErr w:type="spellStart"/>
+      <w:r>
+        <w:rPr>
+          <w:rFonts w:ascii="Bahnschrift SemiBold SemiConden" w:hAnsi="Bahnschrift SemiBold SemiConden"/>
+          <w:sz w:val="32"/>
+          <w:szCs w:val="32"/>
+        </w:rPr>
+        <w:t>padding</w:t>
+      </w:r>
+      <w:proofErr w:type="spellEnd"/>
+      <w:r>
+        <w:rPr>
+          <w:rFonts w:ascii="Bahnschrift SemiBold SemiConden" w:hAnsi="Bahnschrift SemiBold SemiConden"/>
+          <w:sz w:val="32"/>
+          <w:szCs w:val="32"/>
+        </w:rPr>
+        <w:t xml:space="preserve">, modificando etiquetas a(enlace), modificando el </w:t>
+      </w:r>
+      <w:proofErr w:type="spellStart"/>
+      <w:r>
+        <w:rPr>
+          <w:rFonts w:ascii="Bahnschrift SemiBold SemiConden" w:hAnsi="Bahnschrift SemiBold SemiConden"/>
+          <w:sz w:val="32"/>
+          <w:szCs w:val="32"/>
+        </w:rPr>
+        <w:t>background</w:t>
+      </w:r>
+      <w:proofErr w:type="spellEnd"/>
+      <w:r>
+        <w:rPr>
+          <w:rFonts w:ascii="Bahnschrift SemiBold SemiConden" w:hAnsi="Bahnschrift SemiBold SemiConden"/>
+          <w:sz w:val="32"/>
+          <w:szCs w:val="32"/>
+        </w:rPr>
+        <w:t xml:space="preserve"> con una imagen.</w:t>
+      </w:r>
+    </w:p>
+    <w:p>
+      <w:pPr>
+        <w:jc w:val="center"/>
+        <w:rPr>
+          <w:rFonts w:ascii="Bahnschrift SemiBold SemiConden" w:hAnsi="Bahnschrift SemiBold SemiConden"/>
+          <w:sz w:val="32"/>
+          <w:szCs w:val="32"/>
+        </w:rPr>
+      </w:pPr>
+    </w:p>
+    <w:p>
+      <w:pPr>
+        <w:jc w:val="center"/>
+        <w:rPr>
+          <w:rFonts w:ascii="Bahnschrift SemiBold SemiConden" w:hAnsi="Bahnschrift SemiBold SemiConden"/>
+          <w:sz w:val="32"/>
+          <w:szCs w:val="32"/>
+        </w:rPr>
+      </w:pPr>
+      <w:r>
+        <w:rPr>
+          <w:rFonts w:ascii="Bahnschrift SemiBold SemiConden" w:hAnsi="Bahnschrift SemiBold SemiConden"/>
+          <w:sz w:val="32"/>
+          <w:szCs w:val="32"/>
+        </w:rPr>
+        <w:drawing>
+          <wp:inline distT="0" distB="0" distL="0" distR="0" wp14:anchorId="4B849332" wp14:editId="55756F57">
+            <wp:extent cx="4880113" cy="2301756"/>
+            <wp:effectExtent l="0" t="0" r="0" b="3810"/>
+            <wp:docPr id="641865619" name="Imagen 1"/>
+            <wp:cNvGraphicFramePr>
+              <a:graphicFrameLocks xmlns:a="http://schemas.openxmlformats.org/drawingml/2006/main" noChangeAspect="1"/>
+            </wp:cNvGraphicFramePr>
+            <a:graphic xmlns:a="http://schemas.openxmlformats.org/drawingml/2006/main">
+              <a:graphicData uri="http://schemas.openxmlformats.org/drawingml/2006/picture">
+                <pic:pic xmlns:pic="http://schemas.openxmlformats.org/drawingml/2006/picture">
+                  <pic:nvPicPr>
+                    <pic:cNvPr id="641865619" name=""/>
+                    <pic:cNvPicPr/>
+                  </pic:nvPicPr>
+                  <pic:blipFill>
+                    <a:blip r:embed="rId23"/>
+                    <a:stretch>
+                      <a:fillRect/>
+                    </a:stretch>
+                  </pic:blipFill>
+                  <pic:spPr>
+                    <a:xfrm>
+                      <a:off x="0" y="0"/>
+                      <a:ext cx="4881207" cy="2302272"/>
+                    </a:xfrm>
+                    <a:prstGeom prst="rect">
+                      <a:avLst/>
+                    </a:prstGeom>
+                  </pic:spPr>
+                </pic:pic>
+              </a:graphicData>
+            </a:graphic>
+          </wp:inline>
+        </w:drawing>
+      </w:r>
+    </w:p>
+    <w:p>
+      <w:pPr>
+        <w:jc w:val="center"/>
+        <w:rPr>
+          <w:rFonts w:ascii="Bahnschrift SemiBold SemiConden" w:hAnsi="Bahnschrift SemiBold SemiConden"/>
+          <w:sz w:val="32"/>
+          <w:szCs w:val="32"/>
+        </w:rPr>
+      </w:pPr>
+      <w:r>
+        <w:rPr>
+          <w:rFonts w:ascii="Bahnschrift SemiBold SemiConden" w:hAnsi="Bahnschrift SemiBold SemiConden"/>
+          <w:sz w:val="32"/>
+          <w:szCs w:val="32"/>
+        </w:rPr>
+        <w:t>Resultado final del diseño.</w:t>
+      </w:r>
+    </w:p>
+    <w:p>
+      <w:pPr>
+        <w:jc w:val="center"/>
+        <w:rPr>
+          <w:rFonts w:ascii="Bahnschrift SemiBold SemiConden" w:hAnsi="Bahnschrift SemiBold SemiConden"/>
+          <w:sz w:val="32"/>
+          <w:szCs w:val="32"/>
+        </w:rPr>
+      </w:pPr>
+    </w:p>
+    <w:p>
+      <w:pPr>
+        <w:jc w:val="center"/>
+        <w:rPr>
+          <w:rFonts w:ascii="Bahnschrift SemiBold SemiConden" w:hAnsi="Bahnschrift SemiBold SemiConden"/>
+          <w:sz w:val="32"/>
+          <w:szCs w:val="32"/>
+        </w:rPr>
+      </w:pPr>
+      <w:r>
+        <w:rPr>
+          <w:rFonts w:ascii="Bahnschrift SemiBold SemiConden" w:hAnsi="Bahnschrift SemiBold SemiConden"/>
+          <w:sz w:val="32"/>
+          <w:szCs w:val="32"/>
+        </w:rPr>
+        <w:lastRenderedPageBreak/>
+        <w:drawing>
+          <wp:inline distT="0" distB="0" distL="0" distR="0" wp14:anchorId="07F7084B" wp14:editId="4D09E552">
+            <wp:extent cx="3528392" cy="2917230"/>
+            <wp:effectExtent l="0" t="0" r="0" b="0"/>
+            <wp:docPr id="359688603" name="Imagen 1"/>
+            <wp:cNvGraphicFramePr>
+              <a:graphicFrameLocks xmlns:a="http://schemas.openxmlformats.org/drawingml/2006/main" noChangeAspect="1"/>
+            </wp:cNvGraphicFramePr>
+            <a:graphic xmlns:a="http://schemas.openxmlformats.org/drawingml/2006/main">
+              <a:graphicData uri="http://schemas.openxmlformats.org/drawingml/2006/picture">
+                <pic:pic xmlns:pic="http://schemas.openxmlformats.org/drawingml/2006/picture">
+                  <pic:nvPicPr>
+                    <pic:cNvPr id="359688603" name=""/>
+                    <pic:cNvPicPr/>
+                  </pic:nvPicPr>
+                  <pic:blipFill>
+                    <a:blip r:embed="rId24"/>
+                    <a:stretch>
+                      <a:fillRect/>
+                    </a:stretch>
+                  </pic:blipFill>
+                  <pic:spPr>
+                    <a:xfrm>
+                      <a:off x="0" y="0"/>
+                      <a:ext cx="3530776" cy="2919201"/>
+                    </a:xfrm>
+                    <a:prstGeom prst="rect">
+                      <a:avLst/>
+                    </a:prstGeom>
+                  </pic:spPr>
+                </pic:pic>
+              </a:graphicData>
+            </a:graphic>
+          </wp:inline>
+        </w:drawing>
+      </w:r>
+    </w:p>
+    <w:p>
+      <w:pPr>
+        <w:jc w:val="center"/>
+        <w:rPr>
+          <w:rFonts w:ascii="Bahnschrift SemiBold SemiConden" w:hAnsi="Bahnschrift SemiBold SemiConden"/>
+          <w:sz w:val="32"/>
+          <w:szCs w:val="32"/>
+        </w:rPr>
+      </w:pPr>
+      <w:r>
+        <w:rPr>
+          <w:rFonts w:ascii="Bahnschrift SemiBold SemiConden" w:hAnsi="Bahnschrift SemiBold SemiConden"/>
+          <w:sz w:val="32"/>
+          <w:szCs w:val="32"/>
+        </w:rPr>
+        <w:t xml:space="preserve">Modificando archivo </w:t>
+      </w:r>
+      <w:proofErr w:type="spellStart"/>
+      <w:r>
+        <w:rPr>
+          <w:rFonts w:ascii="Bahnschrift SemiBold SemiConden" w:hAnsi="Bahnschrift SemiBold SemiConden"/>
+          <w:sz w:val="32"/>
+          <w:szCs w:val="32"/>
+        </w:rPr>
+        <w:t>css</w:t>
+      </w:r>
+      <w:proofErr w:type="spellEnd"/>
+      <w:r>
+        <w:rPr>
+          <w:rFonts w:ascii="Bahnschrift SemiBold SemiConden" w:hAnsi="Bahnschrift SemiBold SemiConden"/>
+          <w:sz w:val="32"/>
+          <w:szCs w:val="32"/>
+        </w:rPr>
+        <w:t xml:space="preserve"> del </w:t>
+      </w:r>
+      <w:proofErr w:type="spellStart"/>
+      <w:r>
+        <w:rPr>
+          <w:rFonts w:ascii="Bahnschrift SemiBold SemiConden" w:hAnsi="Bahnschrift SemiBold SemiConden"/>
+          <w:sz w:val="32"/>
+          <w:szCs w:val="32"/>
+        </w:rPr>
+        <w:t>log_in</w:t>
+      </w:r>
+      <w:proofErr w:type="spellEnd"/>
+      <w:r>
+        <w:rPr>
+          <w:rFonts w:ascii="Bahnschrift SemiBold SemiConden" w:hAnsi="Bahnschrift SemiBold SemiConden"/>
+          <w:sz w:val="32"/>
+          <w:szCs w:val="32"/>
+        </w:rPr>
+        <w:t>.</w:t>
+      </w:r>
+    </w:p>
+    <w:p>
+      <w:pPr>
+        <w:jc w:val="center"/>
+        <w:rPr>
+          <w:rFonts w:ascii="Bahnschrift SemiBold SemiConden" w:hAnsi="Bahnschrift SemiBold SemiConden"/>
+          <w:sz w:val="32"/>
+          <w:szCs w:val="32"/>
+        </w:rPr>
+      </w:pPr>
+      <w:r>
+        <w:rPr>
+          <w:rFonts w:ascii="Bahnschrift SemiBold SemiConden" w:hAnsi="Bahnschrift SemiBold SemiConden"/>
+          <w:sz w:val="32"/>
+          <w:szCs w:val="32"/>
+        </w:rPr>
+        <w:drawing>
+          <wp:inline distT="0" distB="0" distL="0" distR="0" wp14:anchorId="3BD92540" wp14:editId="2F4E356B">
+            <wp:extent cx="5400040" cy="2586355"/>
+            <wp:effectExtent l="0" t="0" r="0" b="4445"/>
+            <wp:docPr id="819768575" name="Imagen 1"/>
+            <wp:cNvGraphicFramePr>
+              <a:graphicFrameLocks xmlns:a="http://schemas.openxmlformats.org/drawingml/2006/main" noChangeAspect="1"/>
+            </wp:cNvGraphicFramePr>
+            <a:graphic xmlns:a="http://schemas.openxmlformats.org/drawingml/2006/main">
+              <a:graphicData uri="http://schemas.openxmlformats.org/drawingml/2006/picture">
+                <pic:pic xmlns:pic="http://schemas.openxmlformats.org/drawingml/2006/picture">
+                  <pic:nvPicPr>
+                    <pic:cNvPr id="819768575" name=""/>
+                    <pic:cNvPicPr/>
+                  </pic:nvPicPr>
+                  <pic:blipFill>
+                    <a:blip r:embed="rId25"/>
+                    <a:stretch>
+                      <a:fillRect/>
+                    </a:stretch>
+                  </pic:blipFill>
+                  <pic:spPr>
+                    <a:xfrm>
+                      <a:off x="0" y="0"/>
+                      <a:ext cx="5400040" cy="2586355"/>
+                    </a:xfrm>
+                    <a:prstGeom prst="rect">
+                      <a:avLst/>
+                    </a:prstGeom>
+                  </pic:spPr>
+                </pic:pic>
+              </a:graphicData>
+            </a:graphic>
+          </wp:inline>
+        </w:drawing>
+      </w:r>
+    </w:p>
+    <w:p>
+      <w:pPr>
+        <w:jc w:val="center"/>
+        <w:rPr>
+          <w:rFonts w:ascii="Bahnschrift SemiBold SemiConden" w:hAnsi="Bahnschrift SemiBold SemiConden"/>
+          <w:sz w:val="32"/>
+          <w:szCs w:val="32"/>
+        </w:rPr>
+      </w:pPr>
+      <w:r>
+        <w:rPr>
+          <w:rFonts w:ascii="Bahnschrift SemiBold SemiConden" w:hAnsi="Bahnschrift SemiBold SemiConden"/>
+          <w:sz w:val="32"/>
+          <w:szCs w:val="32"/>
+        </w:rPr>
+        <w:t xml:space="preserve">Y copiamos el estilo del </w:t>
+      </w:r>
+      <w:proofErr w:type="spellStart"/>
+      <w:r>
+        <w:rPr>
+          <w:rFonts w:ascii="Bahnschrift SemiBold SemiConden" w:hAnsi="Bahnschrift SemiBold SemiConden"/>
+          <w:sz w:val="32"/>
+          <w:szCs w:val="32"/>
+        </w:rPr>
+        <w:t>sign_up</w:t>
+      </w:r>
+      <w:proofErr w:type="spellEnd"/>
+      <w:r>
+        <w:rPr>
+          <w:rFonts w:ascii="Bahnschrift SemiBold SemiConden" w:hAnsi="Bahnschrift SemiBold SemiConden"/>
+          <w:sz w:val="32"/>
+          <w:szCs w:val="32"/>
+        </w:rPr>
+        <w:t xml:space="preserve"> y lo aplicamos en el </w:t>
+      </w:r>
+      <w:proofErr w:type="spellStart"/>
+      <w:r>
+        <w:rPr>
+          <w:rFonts w:ascii="Bahnschrift SemiBold SemiConden" w:hAnsi="Bahnschrift SemiBold SemiConden"/>
+          <w:sz w:val="32"/>
+          <w:szCs w:val="32"/>
+        </w:rPr>
+        <w:t>log_in</w:t>
+      </w:r>
+      <w:proofErr w:type="spellEnd"/>
+      <w:r>
+        <w:rPr>
+          <w:rFonts w:ascii="Bahnschrift SemiBold SemiConden" w:hAnsi="Bahnschrift SemiBold SemiConden"/>
+          <w:sz w:val="32"/>
+          <w:szCs w:val="32"/>
+        </w:rPr>
+        <w:t>.</w:t>
+      </w:r>
+    </w:p>
+    <w:p>
+      <w:pPr>
+        <w:jc w:val="center"/>
+        <w:rPr>
+          <w:rFonts w:ascii="Bahnschrift SemiBold SemiConden" w:hAnsi="Bahnschrift SemiBold SemiConden"/>
+          <w:sz w:val="32"/>
+          <w:szCs w:val="32"/>
+        </w:rPr>
+      </w:pPr>
+      <w:r>
+        <w:rPr>
+          <w:rFonts w:ascii="Bahnschrift SemiBold SemiConden" w:hAnsi="Bahnschrift SemiBold SemiConden"/>
+          <w:sz w:val="32"/>
+          <w:szCs w:val="32"/>
+        </w:rPr>
+        <w:t>Solo modificamos algunas cositas para que quede mas limpio, pero en síntesis es lo mismo.</w:t>
+      </w:r>
+    </w:p>
     <w:sectPr>
-      <w:footerReference w:type="default" r:id="rId18"/>
+      <w:footerReference w:type="default" r:id="rId26"/>
       <w:pgSz w:w="11906" w:h="16838"/>
       <w:pgMar w:top="1417" w:right="1701" w:bottom="1417" w:left="1701" w:header="708" w:footer="708" w:gutter="0"/>
       <w:cols w:space="708"/>

</xml_diff>

<commit_message>
Actulizacion de la documentación
</commit_message>
<xml_diff>
--- a/documentacion/DocumentacionDelProyecto.docx
+++ b/documentacion/DocumentacionDelProyecto.docx
@@ -1196,6 +1196,7 @@
         </w:rPr>
         <w:t xml:space="preserve"> tuvimos que modificar </w:t>
       </w:r>
+      <w:proofErr w:type="gramStart"/>
       <w:r>
         <w:rPr>
           <w:rFonts w:ascii="Bahnschrift SemiBold SemiConden" w:hAnsi="Bahnschrift SemiBold SemiConden"/>
@@ -1205,6 +1206,7 @@
         <w:t>el .</w:t>
       </w:r>
       <w:proofErr w:type="spellStart"/>
+      <w:proofErr w:type="gramEnd"/>
       <w:r>
         <w:rPr>
           <w:rFonts w:ascii="Bahnschrift SemiBold SemiConden" w:hAnsi="Bahnschrift SemiBold SemiConden"/>
@@ -1373,6 +1375,7 @@
         <w:t xml:space="preserve">, gap para el espacio entre estos, también modificamos el tamaño de las letras y su color, </w:t>
       </w:r>
       <w:proofErr w:type="spellStart"/>
+      <w:proofErr w:type="gramStart"/>
       <w:r>
         <w:rPr>
           <w:rFonts w:ascii="Bahnschrift SemiBold SemiConden" w:hAnsi="Bahnschrift SemiBold SemiConden"/>
@@ -1388,20 +1391,30 @@
           <w:sz w:val="32"/>
           <w:szCs w:val="32"/>
         </w:rPr>
-        <w:t xml:space="preserve">  y agregamos la animación de barra de anuncios.</w:t>
-      </w:r>
-    </w:p>
-    <w:p>
-      <w:pPr>
-        <w:rPr>
-          <w:rFonts w:ascii="Bahnschrift SemiBold SemiConden" w:hAnsi="Bahnschrift SemiBold SemiConden"/>
-          <w:sz w:val="32"/>
-          <w:szCs w:val="32"/>
-        </w:rPr>
-      </w:pPr>
-      <w:r>
-        <w:rPr>
-          <w:rFonts w:ascii="Bahnschrift SemiBold SemiConden" w:hAnsi="Bahnschrift SemiBold SemiConden"/>
+        <w:t xml:space="preserve">  y</w:t>
+      </w:r>
+      <w:proofErr w:type="gramEnd"/>
+      <w:r>
+        <w:rPr>
+          <w:rFonts w:ascii="Bahnschrift SemiBold SemiConden" w:hAnsi="Bahnschrift SemiBold SemiConden"/>
+          <w:sz w:val="32"/>
+          <w:szCs w:val="32"/>
+        </w:rPr>
+        <w:t xml:space="preserve"> agregamos la animación de barra de anuncios.</w:t>
+      </w:r>
+    </w:p>
+    <w:p>
+      <w:pPr>
+        <w:rPr>
+          <w:rFonts w:ascii="Bahnschrift SemiBold SemiConden" w:hAnsi="Bahnschrift SemiBold SemiConden"/>
+          <w:sz w:val="32"/>
+          <w:szCs w:val="32"/>
+        </w:rPr>
+      </w:pPr>
+      <w:r>
+        <w:rPr>
+          <w:rFonts w:ascii="Bahnschrift SemiBold SemiConden" w:hAnsi="Bahnschrift SemiBold SemiConden"/>
+          <w:noProof/>
           <w:sz w:val="32"/>
           <w:szCs w:val="32"/>
         </w:rPr>
@@ -1601,6 +1614,7 @@
       <w:r>
         <w:rPr>
           <w:rFonts w:ascii="Bahnschrift SemiBold SemiConden" w:hAnsi="Bahnschrift SemiBold SemiConden"/>
+          <w:noProof/>
           <w:sz w:val="32"/>
           <w:szCs w:val="32"/>
         </w:rPr>
@@ -1710,6 +1724,7 @@
       <w:r>
         <w:rPr>
           <w:rFonts w:ascii="Bahnschrift SemiBold SemiConden" w:hAnsi="Bahnschrift SemiBold SemiConden"/>
+          <w:noProof/>
           <w:sz w:val="32"/>
           <w:szCs w:val="32"/>
         </w:rPr>
@@ -1796,6 +1811,7 @@
       <w:r>
         <w:rPr>
           <w:rFonts w:ascii="Bahnschrift SemiBold SemiConden" w:hAnsi="Bahnschrift SemiBold SemiConden"/>
+          <w:noProof/>
           <w:sz w:val="32"/>
           <w:szCs w:val="32"/>
         </w:rPr>
@@ -1849,6 +1865,7 @@
       <w:r>
         <w:rPr>
           <w:rFonts w:ascii="Bahnschrift SemiBold SemiConden" w:hAnsi="Bahnschrift SemiBold SemiConden"/>
+          <w:noProof/>
           <w:sz w:val="32"/>
           <w:szCs w:val="32"/>
         </w:rPr>
@@ -1901,6 +1918,7 @@
       <w:r>
         <w:rPr>
           <w:rFonts w:ascii="Bahnschrift SemiBold SemiConden" w:hAnsi="Bahnschrift SemiBold SemiConden"/>
+          <w:noProof/>
           <w:sz w:val="32"/>
           <w:szCs w:val="32"/>
         </w:rPr>
@@ -2098,6 +2116,7 @@
       <w:r>
         <w:rPr>
           <w:rFonts w:ascii="Bahnschrift SemiBold SemiConden" w:hAnsi="Bahnschrift SemiBold SemiConden"/>
+          <w:noProof/>
           <w:sz w:val="32"/>
           <w:szCs w:val="32"/>
         </w:rPr>
@@ -2178,6 +2197,7 @@
       <w:r>
         <w:rPr>
           <w:rFonts w:ascii="Bahnschrift SemiBold SemiConden" w:hAnsi="Bahnschrift SemiBold SemiConden"/>
+          <w:noProof/>
           <w:sz w:val="32"/>
           <w:szCs w:val="32"/>
         </w:rPr>
@@ -2285,6 +2305,7 @@
       <w:r>
         <w:rPr>
           <w:rFonts w:ascii="Bahnschrift SemiBold SemiConden" w:hAnsi="Bahnschrift SemiBold SemiConden"/>
+          <w:noProof/>
           <w:sz w:val="32"/>
           <w:szCs w:val="32"/>
         </w:rPr>
@@ -2397,8 +2418,1148 @@
         <w:t>Solo modificamos algunas cositas para que quede mas limpio, pero en síntesis es lo mismo.</w:t>
       </w:r>
     </w:p>
+    <w:p>
+      <w:pPr>
+        <w:jc w:val="center"/>
+        <w:rPr>
+          <w:rFonts w:ascii="Bahnschrift SemiBold SemiConden" w:hAnsi="Bahnschrift SemiBold SemiConden"/>
+          <w:sz w:val="32"/>
+          <w:szCs w:val="32"/>
+        </w:rPr>
+      </w:pPr>
+    </w:p>
+    <w:p>
+      <w:pPr>
+        <w:jc w:val="center"/>
+        <w:rPr>
+          <w:rFonts w:ascii="Bahnschrift SemiBold SemiConden" w:hAnsi="Bahnschrift SemiBold SemiConden"/>
+          <w:sz w:val="32"/>
+          <w:szCs w:val="32"/>
+        </w:rPr>
+      </w:pPr>
+    </w:p>
+    <w:p>
+      <w:pPr>
+        <w:jc w:val="center"/>
+        <w:rPr>
+          <w:rFonts w:ascii="Bahnschrift SemiBold SemiConden" w:hAnsi="Bahnschrift SemiBold SemiConden"/>
+          <w:sz w:val="32"/>
+          <w:szCs w:val="32"/>
+        </w:rPr>
+      </w:pPr>
+    </w:p>
+    <w:p>
+      <w:pPr>
+        <w:jc w:val="center"/>
+        <w:rPr>
+          <w:rFonts w:ascii="Bahnschrift SemiBold SemiConden" w:hAnsi="Bahnschrift SemiBold SemiConden"/>
+          <w:sz w:val="32"/>
+          <w:szCs w:val="32"/>
+        </w:rPr>
+      </w:pPr>
+    </w:p>
+    <w:p>
+      <w:pPr>
+        <w:rPr>
+          <w:rFonts w:ascii="Bahnschrift SemiBold SemiConden" w:hAnsi="Bahnschrift SemiBold SemiConden"/>
+          <w:sz w:val="32"/>
+          <w:szCs w:val="32"/>
+        </w:rPr>
+      </w:pPr>
+    </w:p>
+    <w:p>
+      <w:pPr>
+        <w:jc w:val="center"/>
+        <w:rPr>
+          <w:rFonts w:ascii="Bahnschrift SemiBold SemiConden" w:hAnsi="Bahnschrift SemiBold SemiConden"/>
+          <w:sz w:val="32"/>
+          <w:szCs w:val="32"/>
+        </w:rPr>
+      </w:pPr>
+      <w:r>
+        <w:rPr>
+          <w:rFonts w:ascii="Bahnschrift SemiBold SemiConden" w:hAnsi="Bahnschrift SemiBold SemiConden"/>
+          <w:sz w:val="32"/>
+          <w:szCs w:val="32"/>
+        </w:rPr>
+        <w:t>PÁGINA DE CAT</w:t>
+      </w:r>
+      <w:r>
+        <w:rPr>
+          <w:rFonts w:ascii="Bahnschrift SemiBold SemiConden" w:hAnsi="Bahnschrift SemiBold SemiConden"/>
+          <w:sz w:val="32"/>
+          <w:szCs w:val="32"/>
+        </w:rPr>
+        <w:t>Á</w:t>
+      </w:r>
+      <w:r>
+        <w:rPr>
+          <w:rFonts w:ascii="Bahnschrift SemiBold SemiConden" w:hAnsi="Bahnschrift SemiBold SemiConden"/>
+          <w:sz w:val="32"/>
+          <w:szCs w:val="32"/>
+        </w:rPr>
+        <w:t>LOGO</w:t>
+      </w:r>
+    </w:p>
+    <w:p>
+      <w:pPr>
+        <w:rPr>
+          <w:rFonts w:ascii="Bahnschrift SemiBold SemiConden" w:hAnsi="Bahnschrift SemiBold SemiConden"/>
+          <w:sz w:val="32"/>
+          <w:szCs w:val="32"/>
+        </w:rPr>
+      </w:pPr>
+      <w:r>
+        <w:rPr>
+          <w:rFonts w:ascii="Bahnschrift SemiBold SemiConden" w:hAnsi="Bahnschrift SemiBold SemiConden"/>
+          <w:sz w:val="32"/>
+          <w:szCs w:val="32"/>
+        </w:rPr>
+        <w:t>ESTRUCTURA HTML:</w:t>
+      </w:r>
+    </w:p>
+    <w:p>
+      <w:pPr>
+        <w:rPr>
+          <w:rFonts w:ascii="Bahnschrift SemiBold SemiConden" w:hAnsi="Bahnschrift SemiBold SemiConden"/>
+          <w:sz w:val="32"/>
+          <w:szCs w:val="32"/>
+        </w:rPr>
+      </w:pPr>
+      <w:r>
+        <w:rPr>
+          <w:rFonts w:ascii="Bahnschrift SemiBold SemiConden" w:hAnsi="Bahnschrift SemiBold SemiConden"/>
+          <w:sz w:val="32"/>
+          <w:szCs w:val="32"/>
+        </w:rPr>
+        <w:t xml:space="preserve">El catálogo, va a compartir misma estructura en cuanto el </w:t>
+      </w:r>
+      <w:proofErr w:type="spellStart"/>
+      <w:r>
+        <w:rPr>
+          <w:rFonts w:ascii="Bahnschrift SemiBold SemiConden" w:hAnsi="Bahnschrift SemiBold SemiConden"/>
+          <w:sz w:val="32"/>
+          <w:szCs w:val="32"/>
+        </w:rPr>
+        <w:t>header</w:t>
+      </w:r>
+      <w:proofErr w:type="spellEnd"/>
+      <w:r>
+        <w:rPr>
+          <w:rFonts w:ascii="Bahnschrift SemiBold SemiConden" w:hAnsi="Bahnschrift SemiBold SemiConden"/>
+          <w:sz w:val="32"/>
+          <w:szCs w:val="32"/>
+        </w:rPr>
+        <w:t xml:space="preserve"> y </w:t>
+      </w:r>
+      <w:proofErr w:type="spellStart"/>
+      <w:r>
+        <w:rPr>
+          <w:rFonts w:ascii="Bahnschrift SemiBold SemiConden" w:hAnsi="Bahnschrift SemiBold SemiConden"/>
+          <w:sz w:val="32"/>
+          <w:szCs w:val="32"/>
+        </w:rPr>
+        <w:t>footer</w:t>
+      </w:r>
+      <w:proofErr w:type="spellEnd"/>
+      <w:r>
+        <w:rPr>
+          <w:rFonts w:ascii="Bahnschrift SemiBold SemiConden" w:hAnsi="Bahnschrift SemiBold SemiConden"/>
+          <w:sz w:val="32"/>
+          <w:szCs w:val="32"/>
+        </w:rPr>
+        <w:t xml:space="preserve">. En el catálogo desarrollamos de mejor manera la estructura del mismo añadiendo un menú lateral y el </w:t>
+      </w:r>
+      <w:proofErr w:type="spellStart"/>
+      <w:r>
+        <w:rPr>
+          <w:rFonts w:ascii="Bahnschrift SemiBold SemiConden" w:hAnsi="Bahnschrift SemiBold SemiConden"/>
+          <w:sz w:val="32"/>
+          <w:szCs w:val="32"/>
+        </w:rPr>
+        <w:t>footer</w:t>
+      </w:r>
+      <w:proofErr w:type="spellEnd"/>
+      <w:r>
+        <w:rPr>
+          <w:rFonts w:ascii="Bahnschrift SemiBold SemiConden" w:hAnsi="Bahnschrift SemiBold SemiConden"/>
+          <w:sz w:val="32"/>
+          <w:szCs w:val="32"/>
+        </w:rPr>
+        <w:t>.</w:t>
+      </w:r>
+    </w:p>
+    <w:p>
+      <w:pPr>
+        <w:jc w:val="center"/>
+        <w:rPr>
+          <w:rFonts w:ascii="Bahnschrift SemiBold SemiConden" w:hAnsi="Bahnschrift SemiBold SemiConden"/>
+          <w:sz w:val="32"/>
+          <w:szCs w:val="32"/>
+        </w:rPr>
+      </w:pPr>
+      <w:r>
+        <w:rPr>
+          <w:rFonts w:ascii="Bahnschrift SemiBold SemiConden" w:hAnsi="Bahnschrift SemiBold SemiConden"/>
+          <w:sz w:val="32"/>
+          <w:szCs w:val="32"/>
+        </w:rPr>
+        <w:drawing>
+          <wp:inline distT="0" distB="0" distL="0" distR="0" wp14:anchorId="25E7094A" wp14:editId="2B5C2CBB">
+            <wp:extent cx="5229955" cy="3258005"/>
+            <wp:effectExtent l="0" t="0" r="8890" b="0"/>
+            <wp:docPr id="353003054" name="Imagen 1"/>
+            <wp:cNvGraphicFramePr>
+              <a:graphicFrameLocks xmlns:a="http://schemas.openxmlformats.org/drawingml/2006/main" noChangeAspect="1"/>
+            </wp:cNvGraphicFramePr>
+            <a:graphic xmlns:a="http://schemas.openxmlformats.org/drawingml/2006/main">
+              <a:graphicData uri="http://schemas.openxmlformats.org/drawingml/2006/picture">
+                <pic:pic xmlns:pic="http://schemas.openxmlformats.org/drawingml/2006/picture">
+                  <pic:nvPicPr>
+                    <pic:cNvPr id="353003054" name=""/>
+                    <pic:cNvPicPr/>
+                  </pic:nvPicPr>
+                  <pic:blipFill>
+                    <a:blip r:embed="rId26"/>
+                    <a:stretch>
+                      <a:fillRect/>
+                    </a:stretch>
+                  </pic:blipFill>
+                  <pic:spPr>
+                    <a:xfrm>
+                      <a:off x="0" y="0"/>
+                      <a:ext cx="5229955" cy="3258005"/>
+                    </a:xfrm>
+                    <a:prstGeom prst="rect">
+                      <a:avLst/>
+                    </a:prstGeom>
+                  </pic:spPr>
+                </pic:pic>
+              </a:graphicData>
+            </a:graphic>
+          </wp:inline>
+        </w:drawing>
+      </w:r>
+    </w:p>
+    <w:p>
+      <w:pPr>
+        <w:jc w:val="center"/>
+        <w:rPr>
+          <w:rFonts w:ascii="Bahnschrift SemiBold SemiConden" w:hAnsi="Bahnschrift SemiBold SemiConden"/>
+          <w:sz w:val="32"/>
+          <w:szCs w:val="32"/>
+        </w:rPr>
+      </w:pPr>
+    </w:p>
+    <w:p>
+      <w:pPr>
+        <w:jc w:val="center"/>
+        <w:rPr>
+          <w:rFonts w:ascii="Bahnschrift SemiBold SemiConden" w:hAnsi="Bahnschrift SemiBold SemiConden"/>
+          <w:sz w:val="32"/>
+          <w:szCs w:val="32"/>
+        </w:rPr>
+      </w:pPr>
+    </w:p>
+    <w:p>
+      <w:pPr>
+        <w:jc w:val="center"/>
+        <w:rPr>
+          <w:rFonts w:ascii="Bahnschrift SemiBold SemiConden" w:hAnsi="Bahnschrift SemiBold SemiConden"/>
+          <w:sz w:val="32"/>
+          <w:szCs w:val="32"/>
+        </w:rPr>
+      </w:pPr>
+    </w:p>
+    <w:p>
+      <w:pPr>
+        <w:jc w:val="center"/>
+        <w:rPr>
+          <w:rFonts w:ascii="Bahnschrift SemiBold SemiConden" w:hAnsi="Bahnschrift SemiBold SemiConden"/>
+          <w:sz w:val="32"/>
+          <w:szCs w:val="32"/>
+        </w:rPr>
+      </w:pPr>
+    </w:p>
+    <w:p>
+      <w:pPr>
+        <w:jc w:val="center"/>
+        <w:rPr>
+          <w:rFonts w:ascii="Bahnschrift SemiBold SemiConden" w:hAnsi="Bahnschrift SemiBold SemiConden"/>
+          <w:sz w:val="32"/>
+          <w:szCs w:val="32"/>
+        </w:rPr>
+      </w:pPr>
+    </w:p>
+    <w:p>
+      <w:pPr>
+        <w:jc w:val="center"/>
+        <w:rPr>
+          <w:rFonts w:ascii="Bahnschrift SemiBold SemiConden" w:hAnsi="Bahnschrift SemiBold SemiConden"/>
+          <w:sz w:val="32"/>
+          <w:szCs w:val="32"/>
+        </w:rPr>
+      </w:pPr>
+    </w:p>
+    <w:p>
+      <w:pPr>
+        <w:jc w:val="center"/>
+        <w:rPr>
+          <w:rFonts w:ascii="Bahnschrift SemiBold SemiConden" w:hAnsi="Bahnschrift SemiBold SemiConden"/>
+          <w:sz w:val="32"/>
+          <w:szCs w:val="32"/>
+        </w:rPr>
+      </w:pPr>
+    </w:p>
+    <w:p>
+      <w:pPr>
+        <w:jc w:val="center"/>
+        <w:rPr>
+          <w:rFonts w:ascii="Bahnschrift SemiBold SemiConden" w:hAnsi="Bahnschrift SemiBold SemiConden"/>
+          <w:sz w:val="32"/>
+          <w:szCs w:val="32"/>
+        </w:rPr>
+      </w:pPr>
+    </w:p>
+    <w:p>
+      <w:pPr>
+        <w:jc w:val="center"/>
+        <w:rPr>
+          <w:rFonts w:ascii="Bahnschrift SemiBold SemiConden" w:hAnsi="Bahnschrift SemiBold SemiConden"/>
+          <w:sz w:val="32"/>
+          <w:szCs w:val="32"/>
+        </w:rPr>
+      </w:pPr>
+    </w:p>
+    <w:p>
+      <w:pPr>
+        <w:jc w:val="center"/>
+        <w:rPr>
+          <w:rFonts w:ascii="Bahnschrift SemiBold SemiConden" w:hAnsi="Bahnschrift SemiBold SemiConden"/>
+          <w:sz w:val="32"/>
+          <w:szCs w:val="32"/>
+        </w:rPr>
+      </w:pPr>
+      <w:r>
+        <w:rPr>
+          <w:rFonts w:ascii="Bahnschrift SemiBold SemiConden" w:hAnsi="Bahnschrift SemiBold SemiConden"/>
+          <w:sz w:val="32"/>
+          <w:szCs w:val="32"/>
+        </w:rPr>
+        <w:lastRenderedPageBreak/>
+        <w:t xml:space="preserve">Dentro del Main añadimos los productos que tenemos disponibles, con un </w:t>
+      </w:r>
+      <w:proofErr w:type="spellStart"/>
+      <w:r>
+        <w:rPr>
+          <w:rFonts w:ascii="Bahnschrift SemiBold SemiConden" w:hAnsi="Bahnschrift SemiBold SemiConden"/>
+          <w:sz w:val="32"/>
+          <w:szCs w:val="32"/>
+        </w:rPr>
+        <w:t>button</w:t>
+      </w:r>
+      <w:proofErr w:type="spellEnd"/>
+      <w:r>
+        <w:rPr>
+          <w:rFonts w:ascii="Bahnschrift SemiBold SemiConden" w:hAnsi="Bahnschrift SemiBold SemiConden"/>
+          <w:sz w:val="32"/>
+          <w:szCs w:val="32"/>
+        </w:rPr>
+        <w:t xml:space="preserve"> para añadir al carrito</w:t>
+      </w:r>
+    </w:p>
+    <w:p>
+      <w:pPr>
+        <w:jc w:val="center"/>
+        <w:rPr>
+          <w:rFonts w:ascii="Bahnschrift SemiBold SemiConden" w:hAnsi="Bahnschrift SemiBold SemiConden"/>
+          <w:sz w:val="32"/>
+          <w:szCs w:val="32"/>
+        </w:rPr>
+      </w:pPr>
+      <w:r>
+        <w:rPr>
+          <w:rFonts w:ascii="Bahnschrift SemiBold SemiConden" w:hAnsi="Bahnschrift SemiBold SemiConden"/>
+          <w:sz w:val="32"/>
+          <w:szCs w:val="32"/>
+        </w:rPr>
+        <w:drawing>
+          <wp:inline distT="0" distB="0" distL="0" distR="0" wp14:anchorId="6706554F" wp14:editId="4D624648">
+            <wp:extent cx="5400040" cy="3463925"/>
+            <wp:effectExtent l="0" t="0" r="0" b="3175"/>
+            <wp:docPr id="2086032043" name="Imagen 1"/>
+            <wp:cNvGraphicFramePr>
+              <a:graphicFrameLocks xmlns:a="http://schemas.openxmlformats.org/drawingml/2006/main" noChangeAspect="1"/>
+            </wp:cNvGraphicFramePr>
+            <a:graphic xmlns:a="http://schemas.openxmlformats.org/drawingml/2006/main">
+              <a:graphicData uri="http://schemas.openxmlformats.org/drawingml/2006/picture">
+                <pic:pic xmlns:pic="http://schemas.openxmlformats.org/drawingml/2006/picture">
+                  <pic:nvPicPr>
+                    <pic:cNvPr id="2086032043" name=""/>
+                    <pic:cNvPicPr/>
+                  </pic:nvPicPr>
+                  <pic:blipFill>
+                    <a:blip r:embed="rId27"/>
+                    <a:stretch>
+                      <a:fillRect/>
+                    </a:stretch>
+                  </pic:blipFill>
+                  <pic:spPr>
+                    <a:xfrm>
+                      <a:off x="0" y="0"/>
+                      <a:ext cx="5400040" cy="3463925"/>
+                    </a:xfrm>
+                    <a:prstGeom prst="rect">
+                      <a:avLst/>
+                    </a:prstGeom>
+                  </pic:spPr>
+                </pic:pic>
+              </a:graphicData>
+            </a:graphic>
+          </wp:inline>
+        </w:drawing>
+      </w:r>
+    </w:p>
+    <w:p>
+      <w:pPr>
+        <w:jc w:val="center"/>
+        <w:rPr>
+          <w:rFonts w:ascii="Bahnschrift SemiBold SemiConden" w:hAnsi="Bahnschrift SemiBold SemiConden"/>
+          <w:sz w:val="32"/>
+          <w:szCs w:val="32"/>
+        </w:rPr>
+      </w:pPr>
+      <w:r>
+        <w:rPr>
+          <w:rFonts w:ascii="Bahnschrift SemiBold SemiConden" w:hAnsi="Bahnschrift SemiBold SemiConden"/>
+          <w:sz w:val="32"/>
+          <w:szCs w:val="32"/>
+        </w:rPr>
+        <w:t xml:space="preserve">Esto sería el </w:t>
+      </w:r>
+      <w:proofErr w:type="spellStart"/>
+      <w:r>
+        <w:rPr>
+          <w:rFonts w:ascii="Bahnschrift SemiBold SemiConden" w:hAnsi="Bahnschrift SemiBold SemiConden"/>
+          <w:sz w:val="32"/>
+          <w:szCs w:val="32"/>
+        </w:rPr>
+        <w:t>footer</w:t>
+      </w:r>
+      <w:proofErr w:type="spellEnd"/>
+      <w:r>
+        <w:rPr>
+          <w:rFonts w:ascii="Bahnschrift SemiBold SemiConden" w:hAnsi="Bahnschrift SemiBold SemiConden"/>
+          <w:sz w:val="32"/>
+          <w:szCs w:val="32"/>
+        </w:rPr>
+        <w:t xml:space="preserve"> con links a las diferentes redes sociales de la empresa.</w:t>
+      </w:r>
+      <w:r>
+        <w:rPr>
+          <w:rFonts w:ascii="Bahnschrift SemiBold SemiConden" w:hAnsi="Bahnschrift SemiBold SemiConden"/>
+          <w:sz w:val="32"/>
+          <w:szCs w:val="32"/>
+        </w:rPr>
+        <w:drawing>
+          <wp:inline distT="0" distB="0" distL="0" distR="0" wp14:anchorId="1C53EF1C" wp14:editId="5F3F095A">
+            <wp:extent cx="5400040" cy="1568450"/>
+            <wp:effectExtent l="0" t="0" r="0" b="0"/>
+            <wp:docPr id="1830468969" name="Imagen 1"/>
+            <wp:cNvGraphicFramePr>
+              <a:graphicFrameLocks xmlns:a="http://schemas.openxmlformats.org/drawingml/2006/main" noChangeAspect="1"/>
+            </wp:cNvGraphicFramePr>
+            <a:graphic xmlns:a="http://schemas.openxmlformats.org/drawingml/2006/main">
+              <a:graphicData uri="http://schemas.openxmlformats.org/drawingml/2006/picture">
+                <pic:pic xmlns:pic="http://schemas.openxmlformats.org/drawingml/2006/picture">
+                  <pic:nvPicPr>
+                    <pic:cNvPr id="1830468969" name=""/>
+                    <pic:cNvPicPr/>
+                  </pic:nvPicPr>
+                  <pic:blipFill>
+                    <a:blip r:embed="rId28"/>
+                    <a:stretch>
+                      <a:fillRect/>
+                    </a:stretch>
+                  </pic:blipFill>
+                  <pic:spPr>
+                    <a:xfrm>
+                      <a:off x="0" y="0"/>
+                      <a:ext cx="5400040" cy="1568450"/>
+                    </a:xfrm>
+                    <a:prstGeom prst="rect">
+                      <a:avLst/>
+                    </a:prstGeom>
+                  </pic:spPr>
+                </pic:pic>
+              </a:graphicData>
+            </a:graphic>
+          </wp:inline>
+        </w:drawing>
+      </w:r>
+    </w:p>
+    <w:p>
+      <w:pPr>
+        <w:jc w:val="center"/>
+        <w:rPr>
+          <w:rFonts w:ascii="Bahnschrift SemiBold SemiConden" w:hAnsi="Bahnschrift SemiBold SemiConden"/>
+          <w:sz w:val="32"/>
+          <w:szCs w:val="32"/>
+        </w:rPr>
+      </w:pPr>
+    </w:p>
+    <w:p>
+      <w:pPr>
+        <w:jc w:val="center"/>
+        <w:rPr>
+          <w:rFonts w:ascii="Bahnschrift SemiBold SemiConden" w:hAnsi="Bahnschrift SemiBold SemiConden"/>
+          <w:sz w:val="32"/>
+          <w:szCs w:val="32"/>
+        </w:rPr>
+      </w:pPr>
+    </w:p>
+    <w:p>
+      <w:pPr>
+        <w:jc w:val="center"/>
+        <w:rPr>
+          <w:rFonts w:ascii="Bahnschrift SemiBold SemiConden" w:hAnsi="Bahnschrift SemiBold SemiConden"/>
+          <w:sz w:val="32"/>
+          <w:szCs w:val="32"/>
+        </w:rPr>
+      </w:pPr>
+    </w:p>
+    <w:p>
+      <w:pPr>
+        <w:jc w:val="center"/>
+        <w:rPr>
+          <w:rFonts w:ascii="Bahnschrift SemiBold SemiConden" w:hAnsi="Bahnschrift SemiBold SemiConden"/>
+          <w:sz w:val="32"/>
+          <w:szCs w:val="32"/>
+        </w:rPr>
+      </w:pPr>
+    </w:p>
+    <w:p>
+      <w:pPr>
+        <w:jc w:val="center"/>
+        <w:rPr>
+          <w:rFonts w:ascii="Bahnschrift SemiBold SemiConden" w:hAnsi="Bahnschrift SemiBold SemiConden"/>
+          <w:sz w:val="32"/>
+          <w:szCs w:val="32"/>
+        </w:rPr>
+      </w:pPr>
+    </w:p>
+    <w:p>
+      <w:pPr>
+        <w:jc w:val="center"/>
+        <w:rPr>
+          <w:rFonts w:ascii="Bahnschrift SemiBold SemiConden" w:hAnsi="Bahnschrift SemiBold SemiConden"/>
+          <w:sz w:val="32"/>
+          <w:szCs w:val="32"/>
+        </w:rPr>
+      </w:pPr>
+    </w:p>
+    <w:p>
+      <w:pPr>
+        <w:jc w:val="center"/>
+        <w:rPr>
+          <w:rFonts w:ascii="Bahnschrift SemiBold SemiConden" w:hAnsi="Bahnschrift SemiBold SemiConden"/>
+          <w:sz w:val="32"/>
+          <w:szCs w:val="32"/>
+        </w:rPr>
+      </w:pPr>
+      <w:r>
+        <w:rPr>
+          <w:rFonts w:ascii="Bahnschrift SemiBold SemiConden" w:hAnsi="Bahnschrift SemiBold SemiConden"/>
+          <w:sz w:val="32"/>
+          <w:szCs w:val="32"/>
+        </w:rPr>
+        <w:lastRenderedPageBreak/>
+        <w:t xml:space="preserve">En el archivo de </w:t>
+      </w:r>
+      <w:proofErr w:type="spellStart"/>
+      <w:r>
+        <w:rPr>
+          <w:rFonts w:ascii="Bahnschrift SemiBold SemiConden" w:hAnsi="Bahnschrift SemiBold SemiConden"/>
+          <w:sz w:val="32"/>
+          <w:szCs w:val="32"/>
+        </w:rPr>
+        <w:t>javascript</w:t>
+      </w:r>
+      <w:proofErr w:type="spellEnd"/>
+      <w:r>
+        <w:rPr>
+          <w:rFonts w:ascii="Bahnschrift SemiBold SemiConden" w:hAnsi="Bahnschrift SemiBold SemiConden"/>
+          <w:sz w:val="32"/>
+          <w:szCs w:val="32"/>
+        </w:rPr>
+        <w:t xml:space="preserve">, lo utilizamos para la funcionalidad del menú lateral. Básicamente añade una etiqueta a cada elemento a través de los id de cada elemento y adentro del </w:t>
+      </w:r>
+      <w:proofErr w:type="spellStart"/>
+      <w:r>
+        <w:rPr>
+          <w:rFonts w:ascii="Bahnschrift SemiBold SemiConden" w:hAnsi="Bahnschrift SemiBold SemiConden"/>
+          <w:sz w:val="32"/>
+          <w:szCs w:val="32"/>
+        </w:rPr>
+        <w:t>css</w:t>
+      </w:r>
+      <w:proofErr w:type="spellEnd"/>
+      <w:r>
+        <w:rPr>
+          <w:rFonts w:ascii="Bahnschrift SemiBold SemiConden" w:hAnsi="Bahnschrift SemiBold SemiConden"/>
+          <w:sz w:val="32"/>
+          <w:szCs w:val="32"/>
+        </w:rPr>
+        <w:t xml:space="preserve"> hace que aparezca y desaparezca.</w:t>
+      </w:r>
+    </w:p>
+    <w:p>
+      <w:pPr>
+        <w:jc w:val="center"/>
+        <w:rPr>
+          <w:rFonts w:ascii="Bahnschrift SemiBold SemiConden" w:hAnsi="Bahnschrift SemiBold SemiConden"/>
+          <w:sz w:val="32"/>
+          <w:szCs w:val="32"/>
+        </w:rPr>
+      </w:pPr>
+      <w:r>
+        <w:rPr>
+          <w:rFonts w:ascii="Bahnschrift SemiBold SemiConden" w:hAnsi="Bahnschrift SemiBold SemiConden"/>
+          <w:sz w:val="32"/>
+          <w:szCs w:val="32"/>
+        </w:rPr>
+        <w:drawing>
+          <wp:inline distT="0" distB="0" distL="0" distR="0" wp14:anchorId="57ABBA4D" wp14:editId="7216EFBD">
+            <wp:extent cx="5163271" cy="2095792"/>
+            <wp:effectExtent l="0" t="0" r="0" b="0"/>
+            <wp:docPr id="1624737127" name="Imagen 1"/>
+            <wp:cNvGraphicFramePr>
+              <a:graphicFrameLocks xmlns:a="http://schemas.openxmlformats.org/drawingml/2006/main" noChangeAspect="1"/>
+            </wp:cNvGraphicFramePr>
+            <a:graphic xmlns:a="http://schemas.openxmlformats.org/drawingml/2006/main">
+              <a:graphicData uri="http://schemas.openxmlformats.org/drawingml/2006/picture">
+                <pic:pic xmlns:pic="http://schemas.openxmlformats.org/drawingml/2006/picture">
+                  <pic:nvPicPr>
+                    <pic:cNvPr id="1624737127" name=""/>
+                    <pic:cNvPicPr/>
+                  </pic:nvPicPr>
+                  <pic:blipFill>
+                    <a:blip r:embed="rId29"/>
+                    <a:stretch>
+                      <a:fillRect/>
+                    </a:stretch>
+                  </pic:blipFill>
+                  <pic:spPr>
+                    <a:xfrm>
+                      <a:off x="0" y="0"/>
+                      <a:ext cx="5163271" cy="2095792"/>
+                    </a:xfrm>
+                    <a:prstGeom prst="rect">
+                      <a:avLst/>
+                    </a:prstGeom>
+                  </pic:spPr>
+                </pic:pic>
+              </a:graphicData>
+            </a:graphic>
+          </wp:inline>
+        </w:drawing>
+      </w:r>
+    </w:p>
+    <w:p>
+      <w:pPr>
+        <w:jc w:val="center"/>
+        <w:rPr>
+          <w:rFonts w:ascii="Bahnschrift SemiBold SemiConden" w:hAnsi="Bahnschrift SemiBold SemiConden"/>
+          <w:sz w:val="32"/>
+          <w:szCs w:val="32"/>
+        </w:rPr>
+      </w:pPr>
+      <w:r>
+        <w:rPr>
+          <w:rFonts w:ascii="Bahnschrift SemiBold SemiConden" w:hAnsi="Bahnschrift SemiBold SemiConden"/>
+          <w:sz w:val="32"/>
+          <w:szCs w:val="32"/>
+        </w:rPr>
+        <w:t>DISEÑO del CSS</w:t>
+      </w:r>
+    </w:p>
+    <w:p>
+      <w:pPr>
+        <w:jc w:val="center"/>
+        <w:rPr>
+          <w:rFonts w:ascii="Bahnschrift SemiBold SemiConden" w:hAnsi="Bahnschrift SemiBold SemiConden"/>
+          <w:sz w:val="32"/>
+          <w:szCs w:val="32"/>
+        </w:rPr>
+      </w:pPr>
+      <w:r>
+        <w:rPr>
+          <w:rFonts w:ascii="Bahnschrift SemiBold SemiConden" w:hAnsi="Bahnschrift SemiBold SemiConden"/>
+          <w:sz w:val="32"/>
+          <w:szCs w:val="32"/>
+        </w:rPr>
+        <w:drawing>
+          <wp:inline distT="0" distB="0" distL="0" distR="0" wp14:anchorId="35BBECD0" wp14:editId="720F247E">
+            <wp:extent cx="5400040" cy="4208780"/>
+            <wp:effectExtent l="0" t="0" r="0" b="1270"/>
+            <wp:docPr id="951942642" name="Imagen 1"/>
+            <wp:cNvGraphicFramePr>
+              <a:graphicFrameLocks xmlns:a="http://schemas.openxmlformats.org/drawingml/2006/main" noChangeAspect="1"/>
+            </wp:cNvGraphicFramePr>
+            <a:graphic xmlns:a="http://schemas.openxmlformats.org/drawingml/2006/main">
+              <a:graphicData uri="http://schemas.openxmlformats.org/drawingml/2006/picture">
+                <pic:pic xmlns:pic="http://schemas.openxmlformats.org/drawingml/2006/picture">
+                  <pic:nvPicPr>
+                    <pic:cNvPr id="951942642" name=""/>
+                    <pic:cNvPicPr/>
+                  </pic:nvPicPr>
+                  <pic:blipFill>
+                    <a:blip r:embed="rId30"/>
+                    <a:stretch>
+                      <a:fillRect/>
+                    </a:stretch>
+                  </pic:blipFill>
+                  <pic:spPr>
+                    <a:xfrm>
+                      <a:off x="0" y="0"/>
+                      <a:ext cx="5400040" cy="4208780"/>
+                    </a:xfrm>
+                    <a:prstGeom prst="rect">
+                      <a:avLst/>
+                    </a:prstGeom>
+                  </pic:spPr>
+                </pic:pic>
+              </a:graphicData>
+            </a:graphic>
+          </wp:inline>
+        </w:drawing>
+      </w:r>
+    </w:p>
+    <w:p>
+      <w:pPr>
+        <w:jc w:val="center"/>
+        <w:rPr>
+          <w:rFonts w:ascii="Bahnschrift SemiBold SemiConden" w:hAnsi="Bahnschrift SemiBold SemiConden"/>
+          <w:sz w:val="32"/>
+          <w:szCs w:val="32"/>
+        </w:rPr>
+      </w:pPr>
+      <w:r>
+        <w:rPr>
+          <w:rFonts w:ascii="Bahnschrift SemiBold SemiConden" w:hAnsi="Bahnschrift SemiBold SemiConden"/>
+          <w:sz w:val="32"/>
+          <w:szCs w:val="32"/>
+        </w:rPr>
+        <w:t>En cuanto el diseño, como es mucho en difícil de resumir.</w:t>
+      </w:r>
+    </w:p>
+    <w:p>
+      <w:pPr>
+        <w:jc w:val="center"/>
+        <w:rPr>
+          <w:rFonts w:ascii="Bahnschrift SemiBold SemiConden" w:hAnsi="Bahnschrift SemiBold SemiConden"/>
+          <w:sz w:val="32"/>
+          <w:szCs w:val="32"/>
+        </w:rPr>
+      </w:pPr>
+      <w:r>
+        <w:rPr>
+          <w:rFonts w:ascii="Bahnschrift SemiBold SemiConden" w:hAnsi="Bahnschrift SemiBold SemiConden"/>
+          <w:sz w:val="32"/>
+          <w:szCs w:val="32"/>
+        </w:rPr>
+        <w:lastRenderedPageBreak/>
+        <w:t xml:space="preserve">Pero Siempre utilizamos lo mismo, </w:t>
+      </w:r>
+      <w:proofErr w:type="spellStart"/>
+      <w:r>
+        <w:rPr>
+          <w:rFonts w:ascii="Bahnschrift SemiBold SemiConden" w:hAnsi="Bahnschrift SemiBold SemiConden"/>
+          <w:sz w:val="32"/>
+          <w:szCs w:val="32"/>
+        </w:rPr>
+        <w:t>background</w:t>
+      </w:r>
+      <w:proofErr w:type="spellEnd"/>
+      <w:r>
+        <w:rPr>
+          <w:rFonts w:ascii="Bahnschrift SemiBold SemiConden" w:hAnsi="Bahnschrift SemiBold SemiConden"/>
+          <w:sz w:val="32"/>
+          <w:szCs w:val="32"/>
+        </w:rPr>
+        <w:t xml:space="preserve">-color, color, especificamos tamaño de los elementos, </w:t>
+      </w:r>
+      <w:proofErr w:type="spellStart"/>
+      <w:r>
+        <w:rPr>
+          <w:rFonts w:ascii="Bahnschrift SemiBold SemiConden" w:hAnsi="Bahnschrift SemiBold SemiConden"/>
+          <w:sz w:val="32"/>
+          <w:szCs w:val="32"/>
+        </w:rPr>
+        <w:t>text-shadow</w:t>
+      </w:r>
+      <w:proofErr w:type="spellEnd"/>
+      <w:r>
+        <w:rPr>
+          <w:rFonts w:ascii="Bahnschrift SemiBold SemiConden" w:hAnsi="Bahnschrift SemiBold SemiConden"/>
+          <w:sz w:val="32"/>
+          <w:szCs w:val="32"/>
+        </w:rPr>
+        <w:t>, box-</w:t>
+      </w:r>
+      <w:proofErr w:type="spellStart"/>
+      <w:r>
+        <w:rPr>
+          <w:rFonts w:ascii="Bahnschrift SemiBold SemiConden" w:hAnsi="Bahnschrift SemiBold SemiConden"/>
+          <w:sz w:val="32"/>
+          <w:szCs w:val="32"/>
+        </w:rPr>
+        <w:t>shadow</w:t>
+      </w:r>
+      <w:proofErr w:type="spellEnd"/>
+      <w:r>
+        <w:rPr>
+          <w:rFonts w:ascii="Bahnschrift SemiBold SemiConden" w:hAnsi="Bahnschrift SemiBold SemiConden"/>
+          <w:sz w:val="32"/>
+          <w:szCs w:val="32"/>
+        </w:rPr>
+        <w:t>.</w:t>
+      </w:r>
+    </w:p>
+    <w:p>
+      <w:pPr>
+        <w:jc w:val="center"/>
+        <w:rPr>
+          <w:rFonts w:ascii="Bahnschrift SemiBold SemiConden" w:hAnsi="Bahnschrift SemiBold SemiConden"/>
+          <w:sz w:val="32"/>
+          <w:szCs w:val="32"/>
+        </w:rPr>
+      </w:pPr>
+      <w:r>
+        <w:rPr>
+          <w:rFonts w:ascii="Bahnschrift SemiBold SemiConden" w:hAnsi="Bahnschrift SemiBold SemiConden"/>
+          <w:sz w:val="32"/>
+          <w:szCs w:val="32"/>
+        </w:rPr>
+        <w:t xml:space="preserve">Para posicionas los productos usamos </w:t>
+      </w:r>
+      <w:proofErr w:type="spellStart"/>
+      <w:r>
+        <w:rPr>
+          <w:rFonts w:ascii="Bahnschrift SemiBold SemiConden" w:hAnsi="Bahnschrift SemiBold SemiConden"/>
+          <w:sz w:val="32"/>
+          <w:szCs w:val="32"/>
+        </w:rPr>
+        <w:t>flex</w:t>
+      </w:r>
+      <w:proofErr w:type="spellEnd"/>
+      <w:r>
+        <w:rPr>
+          <w:rFonts w:ascii="Bahnschrift SemiBold SemiConden" w:hAnsi="Bahnschrift SemiBold SemiConden"/>
+          <w:sz w:val="32"/>
+          <w:szCs w:val="32"/>
+        </w:rPr>
+        <w:t>-box.</w:t>
+      </w:r>
+    </w:p>
+    <w:p>
+      <w:pPr>
+        <w:jc w:val="center"/>
+        <w:rPr>
+          <w:rFonts w:ascii="Bahnschrift SemiBold SemiConden" w:hAnsi="Bahnschrift SemiBold SemiConden"/>
+          <w:sz w:val="32"/>
+          <w:szCs w:val="32"/>
+        </w:rPr>
+      </w:pPr>
+      <w:r>
+        <w:rPr>
+          <w:rFonts w:ascii="Bahnschrift SemiBold SemiConden" w:hAnsi="Bahnschrift SemiBold SemiConden"/>
+          <w:sz w:val="32"/>
+          <w:szCs w:val="32"/>
+        </w:rPr>
+        <w:t xml:space="preserve">También utilizamos muchas animaciones </w:t>
+      </w:r>
+      <w:proofErr w:type="gramStart"/>
+      <w:r>
+        <w:rPr>
+          <w:rFonts w:ascii="Bahnschrift SemiBold SemiConden" w:hAnsi="Bahnschrift SemiBold SemiConden"/>
+          <w:sz w:val="32"/>
+          <w:szCs w:val="32"/>
+        </w:rPr>
+        <w:t>con :</w:t>
+      </w:r>
+      <w:proofErr w:type="spellStart"/>
+      <w:r>
+        <w:rPr>
+          <w:rFonts w:ascii="Bahnschrift SemiBold SemiConden" w:hAnsi="Bahnschrift SemiBold SemiConden"/>
+          <w:sz w:val="32"/>
+          <w:szCs w:val="32"/>
+        </w:rPr>
+        <w:t>hover</w:t>
+      </w:r>
+      <w:proofErr w:type="spellEnd"/>
+      <w:proofErr w:type="gramEnd"/>
+      <w:r>
+        <w:rPr>
+          <w:rFonts w:ascii="Bahnschrift SemiBold SemiConden" w:hAnsi="Bahnschrift SemiBold SemiConden"/>
+          <w:sz w:val="32"/>
+          <w:szCs w:val="32"/>
+        </w:rPr>
+        <w:t>, para los cambios de color y posicionamiento cuando el cursor pasa por encima.</w:t>
+      </w:r>
+    </w:p>
+    <w:p>
+      <w:pPr>
+        <w:jc w:val="center"/>
+        <w:rPr>
+          <w:rFonts w:ascii="Bahnschrift SemiBold SemiConden" w:hAnsi="Bahnschrift SemiBold SemiConden"/>
+          <w:sz w:val="32"/>
+          <w:szCs w:val="32"/>
+        </w:rPr>
+      </w:pPr>
+    </w:p>
+    <w:p>
+      <w:pPr>
+        <w:jc w:val="center"/>
+        <w:rPr>
+          <w:rFonts w:ascii="Bahnschrift SemiBold SemiConden" w:hAnsi="Bahnschrift SemiBold SemiConden"/>
+          <w:sz w:val="32"/>
+          <w:szCs w:val="32"/>
+        </w:rPr>
+      </w:pPr>
+      <w:r>
+        <w:rPr>
+          <w:rFonts w:ascii="Bahnschrift SemiBold SemiConden" w:hAnsi="Bahnschrift SemiBold SemiConden"/>
+          <w:sz w:val="32"/>
+          <w:szCs w:val="32"/>
+        </w:rPr>
+        <w:t>El color de la página no me convence del todo, pero vamos mejorando ese tema.</w:t>
+      </w:r>
+    </w:p>
+    <w:p>
+      <w:pPr>
+        <w:jc w:val="center"/>
+        <w:rPr>
+          <w:rFonts w:ascii="Bahnschrift SemiBold SemiConden" w:hAnsi="Bahnschrift SemiBold SemiConden"/>
+          <w:sz w:val="32"/>
+          <w:szCs w:val="32"/>
+        </w:rPr>
+      </w:pPr>
+    </w:p>
+    <w:p>
+      <w:pPr>
+        <w:jc w:val="center"/>
+        <w:rPr>
+          <w:rFonts w:ascii="Bahnschrift SemiBold SemiConden" w:hAnsi="Bahnschrift SemiBold SemiConden"/>
+          <w:sz w:val="32"/>
+          <w:szCs w:val="32"/>
+        </w:rPr>
+      </w:pPr>
+    </w:p>
+    <w:p>
+      <w:pPr>
+        <w:jc w:val="center"/>
+        <w:rPr>
+          <w:rFonts w:ascii="Bahnschrift SemiBold SemiConden" w:hAnsi="Bahnschrift SemiBold SemiConden"/>
+          <w:sz w:val="44"/>
+          <w:szCs w:val="44"/>
+        </w:rPr>
+      </w:pPr>
+      <w:r>
+        <w:rPr>
+          <w:rFonts w:ascii="Bahnschrift SemiBold SemiConden" w:hAnsi="Bahnschrift SemiBold SemiConden"/>
+          <w:sz w:val="44"/>
+          <w:szCs w:val="44"/>
+        </w:rPr>
+        <w:t>Vista de la página de catálogo.</w:t>
+      </w:r>
+    </w:p>
+    <w:p>
+      <w:pPr>
+        <w:jc w:val="center"/>
+        <w:rPr>
+          <w:rFonts w:ascii="Bahnschrift SemiBold SemiConden" w:hAnsi="Bahnschrift SemiBold SemiConden"/>
+          <w:sz w:val="32"/>
+          <w:szCs w:val="32"/>
+        </w:rPr>
+      </w:pPr>
+      <w:r>
+        <w:rPr>
+          <w:rFonts w:ascii="Bahnschrift SemiBold SemiConden" w:hAnsi="Bahnschrift SemiBold SemiConden"/>
+          <w:sz w:val="32"/>
+          <w:szCs w:val="32"/>
+        </w:rPr>
+        <w:t>(Faltan cosas que agregar y todavía tengo que pensar en algunas funciones)</w:t>
+      </w:r>
+    </w:p>
+    <w:p>
+      <w:pPr>
+        <w:jc w:val="center"/>
+        <w:rPr>
+          <w:rFonts w:ascii="Bahnschrift SemiBold SemiConden" w:hAnsi="Bahnschrift SemiBold SemiConden"/>
+          <w:sz w:val="32"/>
+          <w:szCs w:val="32"/>
+        </w:rPr>
+      </w:pPr>
+      <w:r>
+        <w:rPr>
+          <w:rFonts w:ascii="Bahnschrift SemiBold SemiConden" w:hAnsi="Bahnschrift SemiBold SemiConden"/>
+          <w:sz w:val="32"/>
+          <w:szCs w:val="32"/>
+        </w:rPr>
+        <w:drawing>
+          <wp:inline distT="0" distB="0" distL="0" distR="0" wp14:anchorId="1714739C" wp14:editId="4F622DF7">
+            <wp:extent cx="5400040" cy="2567305"/>
+            <wp:effectExtent l="0" t="0" r="0" b="4445"/>
+            <wp:docPr id="411743448" name="Imagen 1"/>
+            <wp:cNvGraphicFramePr>
+              <a:graphicFrameLocks xmlns:a="http://schemas.openxmlformats.org/drawingml/2006/main" noChangeAspect="1"/>
+            </wp:cNvGraphicFramePr>
+            <a:graphic xmlns:a="http://schemas.openxmlformats.org/drawingml/2006/main">
+              <a:graphicData uri="http://schemas.openxmlformats.org/drawingml/2006/picture">
+                <pic:pic xmlns:pic="http://schemas.openxmlformats.org/drawingml/2006/picture">
+                  <pic:nvPicPr>
+                    <pic:cNvPr id="411743448" name=""/>
+                    <pic:cNvPicPr/>
+                  </pic:nvPicPr>
+                  <pic:blipFill>
+                    <a:blip r:embed="rId31"/>
+                    <a:stretch>
+                      <a:fillRect/>
+                    </a:stretch>
+                  </pic:blipFill>
+                  <pic:spPr>
+                    <a:xfrm>
+                      <a:off x="0" y="0"/>
+                      <a:ext cx="5400040" cy="2567305"/>
+                    </a:xfrm>
+                    <a:prstGeom prst="rect">
+                      <a:avLst/>
+                    </a:prstGeom>
+                  </pic:spPr>
+                </pic:pic>
+              </a:graphicData>
+            </a:graphic>
+          </wp:inline>
+        </w:drawing>
+      </w:r>
+    </w:p>
+    <w:p>
+      <w:pPr>
+        <w:jc w:val="center"/>
+        <w:rPr>
+          <w:rFonts w:ascii="Bahnschrift SemiBold SemiConden" w:hAnsi="Bahnschrift SemiBold SemiConden"/>
+          <w:sz w:val="32"/>
+          <w:szCs w:val="32"/>
+        </w:rPr>
+      </w:pPr>
+      <w:r>
+        <w:rPr>
+          <w:rFonts w:ascii="Bahnschrift SemiBold SemiConden" w:hAnsi="Bahnschrift SemiBold SemiConden"/>
+          <w:sz w:val="32"/>
+          <w:szCs w:val="32"/>
+        </w:rPr>
+        <w:lastRenderedPageBreak/>
+        <w:drawing>
+          <wp:inline distT="0" distB="0" distL="0" distR="0" wp14:anchorId="6151EFB9" wp14:editId="3E1B6B42">
+            <wp:extent cx="5400040" cy="2571750"/>
+            <wp:effectExtent l="0" t="0" r="0" b="0"/>
+            <wp:docPr id="1208128875" name="Imagen 1"/>
+            <wp:cNvGraphicFramePr>
+              <a:graphicFrameLocks xmlns:a="http://schemas.openxmlformats.org/drawingml/2006/main" noChangeAspect="1"/>
+            </wp:cNvGraphicFramePr>
+            <a:graphic xmlns:a="http://schemas.openxmlformats.org/drawingml/2006/main">
+              <a:graphicData uri="http://schemas.openxmlformats.org/drawingml/2006/picture">
+                <pic:pic xmlns:pic="http://schemas.openxmlformats.org/drawingml/2006/picture">
+                  <pic:nvPicPr>
+                    <pic:cNvPr id="1208128875" name=""/>
+                    <pic:cNvPicPr/>
+                  </pic:nvPicPr>
+                  <pic:blipFill>
+                    <a:blip r:embed="rId32"/>
+                    <a:stretch>
+                      <a:fillRect/>
+                    </a:stretch>
+                  </pic:blipFill>
+                  <pic:spPr>
+                    <a:xfrm>
+                      <a:off x="0" y="0"/>
+                      <a:ext cx="5400040" cy="2571750"/>
+                    </a:xfrm>
+                    <a:prstGeom prst="rect">
+                      <a:avLst/>
+                    </a:prstGeom>
+                  </pic:spPr>
+                </pic:pic>
+              </a:graphicData>
+            </a:graphic>
+          </wp:inline>
+        </w:drawing>
+      </w:r>
+    </w:p>
+    <w:p>
+      <w:pPr>
+        <w:jc w:val="center"/>
+        <w:rPr>
+          <w:rFonts w:ascii="Bahnschrift SemiBold SemiConden" w:hAnsi="Bahnschrift SemiBold SemiConden"/>
+          <w:sz w:val="32"/>
+          <w:szCs w:val="32"/>
+        </w:rPr>
+      </w:pPr>
+      <w:r>
+        <w:rPr>
+          <w:rFonts w:ascii="Bahnschrift SemiBold SemiConden" w:hAnsi="Bahnschrift SemiBold SemiConden"/>
+          <w:sz w:val="32"/>
+          <w:szCs w:val="32"/>
+        </w:rPr>
+        <w:drawing>
+          <wp:inline distT="0" distB="0" distL="0" distR="0" wp14:anchorId="012B3CAB" wp14:editId="4B55566E">
+            <wp:extent cx="2693504" cy="4214774"/>
+            <wp:effectExtent l="0" t="0" r="0" b="0"/>
+            <wp:docPr id="562203784" name="Imagen 1"/>
+            <wp:cNvGraphicFramePr>
+              <a:graphicFrameLocks xmlns:a="http://schemas.openxmlformats.org/drawingml/2006/main" noChangeAspect="1"/>
+            </wp:cNvGraphicFramePr>
+            <a:graphic xmlns:a="http://schemas.openxmlformats.org/drawingml/2006/main">
+              <a:graphicData uri="http://schemas.openxmlformats.org/drawingml/2006/picture">
+                <pic:pic xmlns:pic="http://schemas.openxmlformats.org/drawingml/2006/picture">
+                  <pic:nvPicPr>
+                    <pic:cNvPr id="562203784" name=""/>
+                    <pic:cNvPicPr/>
+                  </pic:nvPicPr>
+                  <pic:blipFill>
+                    <a:blip r:embed="rId33"/>
+                    <a:stretch>
+                      <a:fillRect/>
+                    </a:stretch>
+                  </pic:blipFill>
+                  <pic:spPr>
+                    <a:xfrm>
+                      <a:off x="0" y="0"/>
+                      <a:ext cx="2700944" cy="4226417"/>
+                    </a:xfrm>
+                    <a:prstGeom prst="rect">
+                      <a:avLst/>
+                    </a:prstGeom>
+                  </pic:spPr>
+                </pic:pic>
+              </a:graphicData>
+            </a:graphic>
+          </wp:inline>
+        </w:drawing>
+      </w:r>
+    </w:p>
+    <w:p>
+      <w:pPr>
+        <w:rPr>
+          <w:rFonts w:ascii="Bahnschrift SemiBold SemiConden" w:hAnsi="Bahnschrift SemiBold SemiConden"/>
+          <w:sz w:val="32"/>
+          <w:szCs w:val="32"/>
+        </w:rPr>
+      </w:pPr>
+    </w:p>
     <w:sectPr>
-      <w:footerReference w:type="default" r:id="rId26"/>
+      <w:footerReference w:type="default" r:id="rId34"/>
       <w:pgSz w:w="11906" w:h="16838"/>
       <w:pgMar w:top="1417" w:right="1701" w:bottom="1417" w:left="1701" w:header="708" w:footer="708" w:gutter="0"/>
       <w:cols w:space="708"/>

</xml_diff>